<commit_message>
heap 1 pattern completed
</commit_message>
<xml_diff>
--- a/6.Heap(Priorityqueue)/41Scheduling  Minimum Cost (Greedy with Priority Queue).docx
+++ b/6.Heap(Priorityqueue)/41Scheduling  Minimum Cost (Greedy with Priority Queue).docx
@@ -1244,6 +1244,7 @@
         <w:rPr>
           <w:b/>
           <w:bCs/>
+          <w:noProof/>
         </w:rPr>
         <w:drawing>
           <wp:inline distT="0" distB="0" distL="0" distR="0" wp14:anchorId="2055E948" wp14:editId="21F9301F">
@@ -3872,15 +3873,7 @@
       </w:r>
       <w:proofErr w:type="spellEnd"/>
       <w:r>
-        <w:t xml:space="preserve">][2] = </w:t>
-      </w:r>
-      <w:proofErr w:type="spellStart"/>
-      <w:r>
-        <w:t>i</w:t>
-      </w:r>
-      <w:proofErr w:type="spellEnd"/>
-      <w:r>
-        <w:t>;</w:t>
+        <w:t>][2] = i;</w:t>
       </w:r>
     </w:p>
     <w:p>
@@ -4251,6 +4244,3789 @@
     <w:p>
       <w:r>
         <w:t>        return res;</w:t>
+      </w:r>
+    </w:p>
+    <w:p>
+      <w:r>
+        <w:t>    }</w:t>
+      </w:r>
+    </w:p>
+    <w:p>
+      <w:r>
+        <w:t>}</w:t>
+      </w:r>
+    </w:p>
+    <w:p/>
+    <w:p/>
+    <w:p/>
+    <w:p>
+      <w:pPr>
+        <w:rPr>
+          <w:b/>
+          <w:bCs/>
+        </w:rPr>
+      </w:pPr>
+      <w:r>
+        <w:rPr>
+          <w:b/>
+          <w:bCs/>
+        </w:rPr>
+        <w:lastRenderedPageBreak/>
+        <w:t xml:space="preserve">LC#867 MIN COST TO HIRE K WORKERS </w:t>
+      </w:r>
+    </w:p>
+    <w:p>
+      <w:pPr>
+        <w:rPr>
+          <w:b/>
+          <w:bCs/>
+        </w:rPr>
+      </w:pPr>
+      <w:r>
+        <w:rPr>
+          <w:b/>
+          <w:bCs/>
+        </w:rPr>
+        <w:t>There are n workers. You are given two integer arrays quality and wage where quality[</w:t>
+      </w:r>
+      <w:proofErr w:type="spellStart"/>
+      <w:r>
+        <w:rPr>
+          <w:b/>
+          <w:bCs/>
+        </w:rPr>
+        <w:t>i</w:t>
+      </w:r>
+      <w:proofErr w:type="spellEnd"/>
+      <w:r>
+        <w:rPr>
+          <w:b/>
+          <w:bCs/>
+        </w:rPr>
+        <w:t>] is the quality of the </w:t>
+      </w:r>
+      <w:proofErr w:type="spellStart"/>
+      <w:r>
+        <w:rPr>
+          <w:b/>
+          <w:bCs/>
+        </w:rPr>
+        <w:t>i</w:t>
+      </w:r>
+      <w:r>
+        <w:rPr>
+          <w:b/>
+          <w:bCs/>
+          <w:vertAlign w:val="superscript"/>
+        </w:rPr>
+        <w:t>th</w:t>
+      </w:r>
+      <w:proofErr w:type="spellEnd"/>
+      <w:r>
+        <w:rPr>
+          <w:b/>
+          <w:bCs/>
+        </w:rPr>
+        <w:t> worker and wage[</w:t>
+      </w:r>
+      <w:proofErr w:type="spellStart"/>
+      <w:r>
+        <w:rPr>
+          <w:b/>
+          <w:bCs/>
+        </w:rPr>
+        <w:t>i</w:t>
+      </w:r>
+      <w:proofErr w:type="spellEnd"/>
+      <w:r>
+        <w:rPr>
+          <w:b/>
+          <w:bCs/>
+        </w:rPr>
+        <w:t>] is the minimum wage expectation for the </w:t>
+      </w:r>
+      <w:proofErr w:type="spellStart"/>
+      <w:r>
+        <w:rPr>
+          <w:b/>
+          <w:bCs/>
+        </w:rPr>
+        <w:t>i</w:t>
+      </w:r>
+      <w:r>
+        <w:rPr>
+          <w:b/>
+          <w:bCs/>
+          <w:vertAlign w:val="superscript"/>
+        </w:rPr>
+        <w:t>th</w:t>
+      </w:r>
+      <w:proofErr w:type="spellEnd"/>
+      <w:r>
+        <w:rPr>
+          <w:b/>
+          <w:bCs/>
+        </w:rPr>
+        <w:t> worker.</w:t>
+      </w:r>
+    </w:p>
+    <w:p>
+      <w:pPr>
+        <w:rPr>
+          <w:b/>
+          <w:bCs/>
+        </w:rPr>
+      </w:pPr>
+      <w:r>
+        <w:rPr>
+          <w:b/>
+          <w:bCs/>
+        </w:rPr>
+        <w:t>We want to hire exactly k workers to form a paid group. To hire a group of k workers, we must pay them according to the following rules:</w:t>
+      </w:r>
+    </w:p>
+    <w:p>
+      <w:pPr>
+        <w:numPr>
+          <w:ilvl w:val="0"/>
+          <w:numId w:val="5"/>
+        </w:numPr>
+        <w:rPr>
+          <w:b/>
+          <w:bCs/>
+        </w:rPr>
+      </w:pPr>
+      <w:r>
+        <w:rPr>
+          <w:b/>
+          <w:bCs/>
+        </w:rPr>
+        <w:t>Every worker in the paid group must be paid at least their minimum wage expectation.</w:t>
+      </w:r>
+    </w:p>
+    <w:p>
+      <w:pPr>
+        <w:numPr>
+          <w:ilvl w:val="0"/>
+          <w:numId w:val="5"/>
+        </w:numPr>
+        <w:rPr>
+          <w:b/>
+          <w:bCs/>
+        </w:rPr>
+      </w:pPr>
+      <w:r>
+        <w:rPr>
+          <w:b/>
+          <w:bCs/>
+        </w:rPr>
+        <w:t>In the group, each worker's pay must be directly proportional to their quality. This means if a worker’s quality is double that of another worker in the group, then they must be paid twice as much as the other worker.</w:t>
+      </w:r>
+    </w:p>
+    <w:p>
+      <w:pPr>
+        <w:rPr>
+          <w:b/>
+          <w:bCs/>
+        </w:rPr>
+      </w:pPr>
+      <w:r>
+        <w:rPr>
+          <w:b/>
+          <w:bCs/>
+        </w:rPr>
+        <w:t>Given the integer k, return </w:t>
+      </w:r>
+      <w:r>
+        <w:rPr>
+          <w:b/>
+          <w:bCs/>
+          <w:i/>
+          <w:iCs/>
+        </w:rPr>
+        <w:t>the least amount of money needed to form a paid group satisfying the above conditions</w:t>
+      </w:r>
+      <w:r>
+        <w:rPr>
+          <w:b/>
+          <w:bCs/>
+        </w:rPr>
+        <w:t>. Answers within 10</w:t>
+      </w:r>
+      <w:r>
+        <w:rPr>
+          <w:b/>
+          <w:bCs/>
+          <w:vertAlign w:val="superscript"/>
+        </w:rPr>
+        <w:t>-5</w:t>
+      </w:r>
+      <w:r>
+        <w:rPr>
+          <w:b/>
+          <w:bCs/>
+        </w:rPr>
+        <w:t> of the actual answer will be accepted.</w:t>
+      </w:r>
+    </w:p>
+    <w:p>
+      <w:pPr>
+        <w:rPr>
+          <w:b/>
+          <w:bCs/>
+        </w:rPr>
+      </w:pPr>
+      <w:r>
+        <w:rPr>
+          <w:b/>
+          <w:bCs/>
+        </w:rPr>
+        <w:t> </w:t>
+      </w:r>
+    </w:p>
+    <w:p>
+      <w:pPr>
+        <w:rPr>
+          <w:b/>
+          <w:bCs/>
+        </w:rPr>
+      </w:pPr>
+      <w:r>
+        <w:rPr>
+          <w:b/>
+          <w:bCs/>
+        </w:rPr>
+        <w:t>Example 1:</w:t>
+      </w:r>
+    </w:p>
+    <w:p>
+      <w:pPr>
+        <w:rPr>
+          <w:b/>
+          <w:bCs/>
+        </w:rPr>
+      </w:pPr>
+      <w:r>
+        <w:rPr>
+          <w:b/>
+          <w:bCs/>
+        </w:rPr>
+        <w:t>Input: quality = [10,20,5], wage = [70,50,30], k = 2</w:t>
+      </w:r>
+    </w:p>
+    <w:p>
+      <w:pPr>
+        <w:rPr>
+          <w:b/>
+          <w:bCs/>
+        </w:rPr>
+      </w:pPr>
+      <w:r>
+        <w:rPr>
+          <w:b/>
+          <w:bCs/>
+        </w:rPr>
+        <w:t>Output: 105.00000</w:t>
+      </w:r>
+    </w:p>
+    <w:p>
+      <w:pPr>
+        <w:rPr>
+          <w:b/>
+          <w:bCs/>
+        </w:rPr>
+      </w:pPr>
+      <w:r>
+        <w:rPr>
+          <w:b/>
+          <w:bCs/>
+        </w:rPr>
+        <w:t>Explanation: We pay 70 to 0</w:t>
+      </w:r>
+      <w:r>
+        <w:rPr>
+          <w:b/>
+          <w:bCs/>
+          <w:vertAlign w:val="superscript"/>
+        </w:rPr>
+        <w:t>th</w:t>
+      </w:r>
+      <w:r>
+        <w:rPr>
+          <w:b/>
+          <w:bCs/>
+        </w:rPr>
+        <w:t xml:space="preserve"> worker and 35 to 2</w:t>
+      </w:r>
+      <w:r>
+        <w:rPr>
+          <w:b/>
+          <w:bCs/>
+          <w:vertAlign w:val="superscript"/>
+        </w:rPr>
+        <w:t>nd</w:t>
+      </w:r>
+      <w:r>
+        <w:rPr>
+          <w:b/>
+          <w:bCs/>
+        </w:rPr>
+        <w:t xml:space="preserve"> worker.</w:t>
+      </w:r>
+    </w:p>
+    <w:p>
+      <w:pPr>
+        <w:rPr>
+          <w:b/>
+          <w:bCs/>
+        </w:rPr>
+      </w:pPr>
+      <w:r>
+        <w:rPr>
+          <w:b/>
+          <w:bCs/>
+        </w:rPr>
+        <w:t>Example 2:</w:t>
+      </w:r>
+    </w:p>
+    <w:p>
+      <w:pPr>
+        <w:rPr>
+          <w:b/>
+          <w:bCs/>
+        </w:rPr>
+      </w:pPr>
+      <w:r>
+        <w:rPr>
+          <w:b/>
+          <w:bCs/>
+        </w:rPr>
+        <w:t>Input: quality = [3,1,10,10,1], wage = [4,8,2,2,7], k = 3</w:t>
+      </w:r>
+    </w:p>
+    <w:p>
+      <w:pPr>
+        <w:rPr>
+          <w:b/>
+          <w:bCs/>
+        </w:rPr>
+      </w:pPr>
+      <w:r>
+        <w:rPr>
+          <w:b/>
+          <w:bCs/>
+        </w:rPr>
+        <w:t>Output: 30.66667</w:t>
+      </w:r>
+    </w:p>
+    <w:p>
+      <w:pPr>
+        <w:rPr>
+          <w:b/>
+          <w:bCs/>
+        </w:rPr>
+      </w:pPr>
+      <w:r>
+        <w:rPr>
+          <w:b/>
+          <w:bCs/>
+        </w:rPr>
+        <w:t>Explanation: We pay 4 to 0</w:t>
+      </w:r>
+      <w:r>
+        <w:rPr>
+          <w:b/>
+          <w:bCs/>
+          <w:vertAlign w:val="superscript"/>
+        </w:rPr>
+        <w:t>th</w:t>
+      </w:r>
+      <w:r>
+        <w:rPr>
+          <w:b/>
+          <w:bCs/>
+        </w:rPr>
+        <w:t xml:space="preserve"> worker, 13.33333 to 2</w:t>
+      </w:r>
+      <w:r>
+        <w:rPr>
+          <w:b/>
+          <w:bCs/>
+          <w:vertAlign w:val="superscript"/>
+        </w:rPr>
+        <w:t>nd</w:t>
+      </w:r>
+      <w:r>
+        <w:rPr>
+          <w:b/>
+          <w:bCs/>
+        </w:rPr>
+        <w:t xml:space="preserve"> and 3</w:t>
+      </w:r>
+      <w:r>
+        <w:rPr>
+          <w:b/>
+          <w:bCs/>
+          <w:vertAlign w:val="superscript"/>
+        </w:rPr>
+        <w:t>rd</w:t>
+      </w:r>
+      <w:r>
+        <w:rPr>
+          <w:b/>
+          <w:bCs/>
+        </w:rPr>
+        <w:t xml:space="preserve"> workers separately.</w:t>
+      </w:r>
+    </w:p>
+    <w:p>
+      <w:pPr>
+        <w:rPr>
+          <w:b/>
+          <w:bCs/>
+        </w:rPr>
+      </w:pPr>
+      <w:r>
+        <w:rPr>
+          <w:b/>
+          <w:bCs/>
+        </w:rPr>
+        <w:t> </w:t>
+      </w:r>
+    </w:p>
+    <w:p>
+      <w:pPr>
+        <w:rPr>
+          <w:b/>
+          <w:bCs/>
+        </w:rPr>
+      </w:pPr>
+      <w:r>
+        <w:rPr>
+          <w:b/>
+          <w:bCs/>
+        </w:rPr>
+        <w:t>Constraints:</w:t>
+      </w:r>
+    </w:p>
+    <w:p>
+      <w:pPr>
+        <w:numPr>
+          <w:ilvl w:val="0"/>
+          <w:numId w:val="6"/>
+        </w:numPr>
+        <w:rPr>
+          <w:b/>
+          <w:bCs/>
+        </w:rPr>
+      </w:pPr>
+      <w:r>
+        <w:rPr>
+          <w:b/>
+          <w:bCs/>
+        </w:rPr>
+        <w:t xml:space="preserve">n == </w:t>
+      </w:r>
+      <w:proofErr w:type="spellStart"/>
+      <w:r>
+        <w:rPr>
+          <w:b/>
+          <w:bCs/>
+        </w:rPr>
+        <w:t>quality.length</w:t>
+      </w:r>
+      <w:proofErr w:type="spellEnd"/>
+      <w:r>
+        <w:rPr>
+          <w:b/>
+          <w:bCs/>
+        </w:rPr>
+        <w:t xml:space="preserve"> == </w:t>
+      </w:r>
+      <w:proofErr w:type="spellStart"/>
+      <w:r>
+        <w:rPr>
+          <w:b/>
+          <w:bCs/>
+        </w:rPr>
+        <w:t>wage.length</w:t>
+      </w:r>
+      <w:proofErr w:type="spellEnd"/>
+    </w:p>
+    <w:p>
+      <w:pPr>
+        <w:numPr>
+          <w:ilvl w:val="0"/>
+          <w:numId w:val="6"/>
+        </w:numPr>
+        <w:rPr>
+          <w:b/>
+          <w:bCs/>
+        </w:rPr>
+      </w:pPr>
+      <w:r>
+        <w:rPr>
+          <w:b/>
+          <w:bCs/>
+        </w:rPr>
+        <w:t>1 &lt;= k &lt;= n &lt;= 10</w:t>
+      </w:r>
+      <w:r>
+        <w:rPr>
+          <w:b/>
+          <w:bCs/>
+          <w:vertAlign w:val="superscript"/>
+        </w:rPr>
+        <w:t>4</w:t>
+      </w:r>
+    </w:p>
+    <w:p>
+      <w:pPr>
+        <w:numPr>
+          <w:ilvl w:val="0"/>
+          <w:numId w:val="6"/>
+        </w:numPr>
+        <w:rPr>
+          <w:b/>
+          <w:bCs/>
+        </w:rPr>
+      </w:pPr>
+      <w:r>
+        <w:rPr>
+          <w:b/>
+          <w:bCs/>
+        </w:rPr>
+        <w:t>1 &lt;= quality[</w:t>
+      </w:r>
+      <w:proofErr w:type="spellStart"/>
+      <w:r>
+        <w:rPr>
+          <w:b/>
+          <w:bCs/>
+        </w:rPr>
+        <w:t>i</w:t>
+      </w:r>
+      <w:proofErr w:type="spellEnd"/>
+      <w:r>
+        <w:rPr>
+          <w:b/>
+          <w:bCs/>
+        </w:rPr>
+        <w:t>], wage[</w:t>
+      </w:r>
+      <w:proofErr w:type="spellStart"/>
+      <w:r>
+        <w:rPr>
+          <w:b/>
+          <w:bCs/>
+        </w:rPr>
+        <w:t>i</w:t>
+      </w:r>
+      <w:proofErr w:type="spellEnd"/>
+      <w:r>
+        <w:rPr>
+          <w:b/>
+          <w:bCs/>
+        </w:rPr>
+        <w:t>] &lt;= 10</w:t>
+      </w:r>
+      <w:r>
+        <w:rPr>
+          <w:b/>
+          <w:bCs/>
+          <w:vertAlign w:val="superscript"/>
+        </w:rPr>
+        <w:t>4</w:t>
+      </w:r>
+    </w:p>
+    <w:p>
+      <w:pPr>
+        <w:rPr>
+          <w:b/>
+          <w:bCs/>
+          <w:vertAlign w:val="superscript"/>
+        </w:rPr>
+      </w:pPr>
+    </w:p>
+    <w:p>
+      <w:pPr>
+        <w:rPr>
+          <w:b/>
+          <w:bCs/>
+          <w:vertAlign w:val="superscript"/>
+        </w:rPr>
+      </w:pPr>
+    </w:p>
+    <w:p>
+      <w:pPr>
+        <w:rPr>
+          <w:b/>
+          <w:bCs/>
+          <w:vertAlign w:val="superscript"/>
+        </w:rPr>
+      </w:pPr>
+    </w:p>
+    <w:p>
+      <w:pPr>
+        <w:rPr>
+          <w:b/>
+          <w:bCs/>
+        </w:rPr>
+      </w:pPr>
+      <w:r>
+        <w:rPr>
+          <w:b/>
+          <w:bCs/>
+        </w:rPr>
+        <w:lastRenderedPageBreak/>
+        <w:t>APP:</w:t>
+      </w:r>
+    </w:p>
+    <w:p>
+      <w:pPr>
+        <w:rPr>
+          <w:b/>
+          <w:bCs/>
+        </w:rPr>
+      </w:pPr>
+      <w:r>
+        <w:rPr>
+          <w:b/>
+          <w:bCs/>
+        </w:rPr>
+        <w:t>-&gt;here the wage doesn’t matter the factor(wage/quality) matters here</w:t>
+      </w:r>
+    </w:p>
+    <w:p>
+      <w:pPr>
+        <w:rPr>
+          <w:b/>
+          <w:bCs/>
+        </w:rPr>
+      </w:pPr>
+      <w:r>
+        <w:rPr>
+          <w:b/>
+          <w:bCs/>
+        </w:rPr>
+        <w:t>-&gt;put the quality and the wage/quality in an array and then sort by quality(ascending)</w:t>
+      </w:r>
+    </w:p>
+    <w:p>
+      <w:pPr>
+        <w:rPr>
+          <w:b/>
+          <w:bCs/>
+        </w:rPr>
+      </w:pPr>
+      <w:r>
+        <w:rPr>
+          <w:b/>
+          <w:bCs/>
+        </w:rPr>
+        <w:t>-&gt;construct a heap (max heap) for storing the quality</w:t>
+      </w:r>
+    </w:p>
+    <w:p>
+      <w:pPr>
+        <w:rPr>
+          <w:b/>
+          <w:bCs/>
+        </w:rPr>
+      </w:pPr>
+      <w:r>
+        <w:rPr>
+          <w:b/>
+          <w:bCs/>
+        </w:rPr>
+        <w:t xml:space="preserve">-&gt;since the </w:t>
+      </w:r>
+      <w:proofErr w:type="spellStart"/>
+      <w:r>
+        <w:rPr>
+          <w:b/>
+          <w:bCs/>
+        </w:rPr>
+        <w:t>arr</w:t>
+      </w:r>
+      <w:proofErr w:type="spellEnd"/>
+      <w:r>
+        <w:rPr>
+          <w:b/>
+          <w:bCs/>
+        </w:rPr>
+        <w:t xml:space="preserve"> is sorted from left to right traversing every time we move it is the ratio is going to increase</w:t>
+      </w:r>
+    </w:p>
+    <w:p>
+      <w:pPr>
+        <w:rPr>
+          <w:b/>
+          <w:bCs/>
+        </w:rPr>
+      </w:pPr>
+      <w:r>
+        <w:rPr>
+          <w:b/>
+          <w:bCs/>
+        </w:rPr>
+        <w:t xml:space="preserve">-&gt; </w:t>
+      </w:r>
+      <w:proofErr w:type="spellStart"/>
+      <w:r>
+        <w:rPr>
+          <w:b/>
+          <w:bCs/>
+        </w:rPr>
+        <w:t>incr</w:t>
+      </w:r>
+      <w:proofErr w:type="spellEnd"/>
+      <w:r>
+        <w:rPr>
+          <w:b/>
+          <w:bCs/>
+        </w:rPr>
+        <w:t xml:space="preserve"> the total every time with the </w:t>
+      </w:r>
+      <w:proofErr w:type="spellStart"/>
+      <w:r>
+        <w:rPr>
+          <w:b/>
+          <w:bCs/>
+        </w:rPr>
+        <w:t>curr</w:t>
+      </w:r>
+      <w:proofErr w:type="spellEnd"/>
+      <w:r>
+        <w:rPr>
+          <w:b/>
+          <w:bCs/>
+        </w:rPr>
+        <w:t xml:space="preserve"> quality  , so when the queue size reaches </w:t>
+      </w:r>
+      <w:proofErr w:type="gramStart"/>
+      <w:r>
+        <w:rPr>
+          <w:b/>
+          <w:bCs/>
+        </w:rPr>
+        <w:t>k</w:t>
+      </w:r>
+      <w:proofErr w:type="gramEnd"/>
+      <w:r>
+        <w:rPr>
+          <w:b/>
+          <w:bCs/>
+        </w:rPr>
+        <w:t xml:space="preserve"> we compute the min salary for all the people in the heap (think of sliding window here) when the size&gt;k </w:t>
+      </w:r>
+      <w:proofErr w:type="gramStart"/>
+      <w:r>
+        <w:rPr>
+          <w:b/>
+          <w:bCs/>
+        </w:rPr>
+        <w:t>remove</w:t>
+      </w:r>
+      <w:proofErr w:type="gramEnd"/>
+      <w:r>
+        <w:rPr>
+          <w:b/>
+          <w:bCs/>
+        </w:rPr>
+        <w:t xml:space="preserve"> the top element such that sliding window is maintained like that not exactly </w:t>
+      </w:r>
+    </w:p>
+    <w:p>
+      <w:pPr>
+        <w:rPr>
+          <w:b/>
+          <w:bCs/>
+        </w:rPr>
+      </w:pPr>
+    </w:p>
+    <w:p>
+      <w:r>
+        <w:t>class Solution {</w:t>
+      </w:r>
+    </w:p>
+    <w:p>
+      <w:r>
+        <w:t xml:space="preserve">    public double </w:t>
+      </w:r>
+      <w:proofErr w:type="spellStart"/>
+      <w:r>
+        <w:t>mincostToHireWorkers</w:t>
+      </w:r>
+      <w:proofErr w:type="spellEnd"/>
+      <w:r>
+        <w:t>(int[] quality, int[] wage, int k) {</w:t>
+      </w:r>
+    </w:p>
+    <w:p>
+      <w:r>
+        <w:t xml:space="preserve">        double </w:t>
+      </w:r>
+      <w:proofErr w:type="spellStart"/>
+      <w:r>
+        <w:t>arr</w:t>
+      </w:r>
+      <w:proofErr w:type="spellEnd"/>
+      <w:r>
+        <w:t>[][] = new double[</w:t>
+      </w:r>
+      <w:proofErr w:type="spellStart"/>
+      <w:r>
+        <w:t>quality.length</w:t>
+      </w:r>
+      <w:proofErr w:type="spellEnd"/>
+      <w:r>
+        <w:t>][2];</w:t>
+      </w:r>
+    </w:p>
+    <w:p>
+      <w:r>
+        <w:t xml:space="preserve">        for(int </w:t>
+      </w:r>
+      <w:proofErr w:type="spellStart"/>
+      <w:r>
+        <w:t>i</w:t>
+      </w:r>
+      <w:proofErr w:type="spellEnd"/>
+      <w:r>
+        <w:t xml:space="preserve"> = 0 ; </w:t>
+      </w:r>
+      <w:proofErr w:type="spellStart"/>
+      <w:r>
+        <w:t>i</w:t>
+      </w:r>
+      <w:proofErr w:type="spellEnd"/>
+      <w:r>
+        <w:t xml:space="preserve">&lt; </w:t>
+      </w:r>
+      <w:proofErr w:type="spellStart"/>
+      <w:r>
+        <w:t>quality.length</w:t>
+      </w:r>
+      <w:proofErr w:type="spellEnd"/>
+      <w:r>
+        <w:t xml:space="preserve"> ; </w:t>
+      </w:r>
+      <w:proofErr w:type="spellStart"/>
+      <w:r>
+        <w:t>i</w:t>
+      </w:r>
+      <w:proofErr w:type="spellEnd"/>
+      <w:r>
+        <w:t>++)</w:t>
+      </w:r>
+    </w:p>
+    <w:p>
+      <w:r>
+        <w:t>        {</w:t>
+      </w:r>
+    </w:p>
+    <w:p>
+      <w:r>
+        <w:t xml:space="preserve">            </w:t>
+      </w:r>
+      <w:proofErr w:type="spellStart"/>
+      <w:r>
+        <w:t>arr</w:t>
+      </w:r>
+      <w:proofErr w:type="spellEnd"/>
+      <w:r>
+        <w:t>[</w:t>
+      </w:r>
+      <w:proofErr w:type="spellStart"/>
+      <w:r>
+        <w:t>i</w:t>
+      </w:r>
+      <w:proofErr w:type="spellEnd"/>
+      <w:r>
+        <w:t>][0] = quality[</w:t>
+      </w:r>
+      <w:proofErr w:type="spellStart"/>
+      <w:r>
+        <w:t>i</w:t>
+      </w:r>
+      <w:proofErr w:type="spellEnd"/>
+      <w:r>
+        <w:t>];</w:t>
+      </w:r>
+    </w:p>
+    <w:p>
+      <w:r>
+        <w:t xml:space="preserve">            </w:t>
+      </w:r>
+      <w:proofErr w:type="spellStart"/>
+      <w:r>
+        <w:t>arr</w:t>
+      </w:r>
+      <w:proofErr w:type="spellEnd"/>
+      <w:r>
+        <w:t>[</w:t>
+      </w:r>
+      <w:proofErr w:type="spellStart"/>
+      <w:r>
+        <w:t>i</w:t>
+      </w:r>
+      <w:proofErr w:type="spellEnd"/>
+      <w:r>
+        <w:t>][1] = (double)wage[</w:t>
+      </w:r>
+      <w:proofErr w:type="spellStart"/>
+      <w:r>
+        <w:t>i</w:t>
+      </w:r>
+      <w:proofErr w:type="spellEnd"/>
+      <w:r>
+        <w:t>]/quality[</w:t>
+      </w:r>
+      <w:proofErr w:type="spellStart"/>
+      <w:r>
+        <w:t>i</w:t>
+      </w:r>
+      <w:proofErr w:type="spellEnd"/>
+      <w:r>
+        <w:t>];</w:t>
+      </w:r>
+    </w:p>
+    <w:p>
+      <w:r>
+        <w:t>        }</w:t>
+      </w:r>
+    </w:p>
+    <w:p/>
+    <w:p>
+      <w:r>
+        <w:t xml:space="preserve">    </w:t>
+      </w:r>
+      <w:proofErr w:type="spellStart"/>
+      <w:r>
+        <w:t>Arrays.sort</w:t>
+      </w:r>
+      <w:proofErr w:type="spellEnd"/>
+      <w:r>
+        <w:t>(</w:t>
+      </w:r>
+      <w:proofErr w:type="spellStart"/>
+      <w:r>
+        <w:t>arr</w:t>
+      </w:r>
+      <w:proofErr w:type="spellEnd"/>
+      <w:r>
+        <w:t>,(</w:t>
+      </w:r>
+      <w:proofErr w:type="spellStart"/>
+      <w:r>
+        <w:t>a,b</w:t>
+      </w:r>
+      <w:proofErr w:type="spellEnd"/>
+      <w:r>
+        <w:t>)-&gt;</w:t>
+      </w:r>
+      <w:proofErr w:type="spellStart"/>
+      <w:r>
+        <w:t>Double.compare</w:t>
+      </w:r>
+      <w:proofErr w:type="spellEnd"/>
+      <w:r>
+        <w:t>(a[1],b[1]));</w:t>
+      </w:r>
+    </w:p>
+    <w:p>
+      <w:r>
+        <w:t xml:space="preserve">        </w:t>
+      </w:r>
+      <w:proofErr w:type="spellStart"/>
+      <w:r>
+        <w:t>PriorityQueue</w:t>
+      </w:r>
+      <w:proofErr w:type="spellEnd"/>
+      <w:r>
+        <w:t xml:space="preserve">&lt;Double&gt; </w:t>
+      </w:r>
+      <w:proofErr w:type="spellStart"/>
+      <w:r>
+        <w:t>pq</w:t>
+      </w:r>
+      <w:proofErr w:type="spellEnd"/>
+      <w:r>
+        <w:t xml:space="preserve"> = new </w:t>
+      </w:r>
+      <w:proofErr w:type="spellStart"/>
+      <w:r>
+        <w:t>PriorityQueue</w:t>
+      </w:r>
+      <w:proofErr w:type="spellEnd"/>
+      <w:r>
+        <w:t>&lt;&gt;((</w:t>
+      </w:r>
+      <w:proofErr w:type="spellStart"/>
+      <w:r>
+        <w:t>a,b</w:t>
+      </w:r>
+      <w:proofErr w:type="spellEnd"/>
+      <w:r>
+        <w:t>)-&gt;</w:t>
+      </w:r>
+      <w:proofErr w:type="spellStart"/>
+      <w:r>
+        <w:t>Double.compare</w:t>
+      </w:r>
+      <w:proofErr w:type="spellEnd"/>
+      <w:r>
+        <w:t>(</w:t>
+      </w:r>
+      <w:proofErr w:type="spellStart"/>
+      <w:r>
+        <w:t>b,a</w:t>
+      </w:r>
+      <w:proofErr w:type="spellEnd"/>
+      <w:r>
+        <w:t>));</w:t>
+      </w:r>
+    </w:p>
+    <w:p/>
+    <w:p>
+      <w:r>
+        <w:t>        double total = 0;</w:t>
+      </w:r>
+    </w:p>
+    <w:p>
+      <w:r>
+        <w:t xml:space="preserve">        double res = </w:t>
+      </w:r>
+      <w:proofErr w:type="spellStart"/>
+      <w:r>
+        <w:t>Double.MAX_VALUE</w:t>
+      </w:r>
+      <w:proofErr w:type="spellEnd"/>
+      <w:r>
+        <w:t>;</w:t>
+      </w:r>
+    </w:p>
+    <w:p/>
+    <w:p/>
+    <w:p/>
+    <w:p/>
+    <w:p>
+      <w:r>
+        <w:lastRenderedPageBreak/>
+        <w:t xml:space="preserve">        for(int </w:t>
+      </w:r>
+      <w:proofErr w:type="spellStart"/>
+      <w:r>
+        <w:t>i</w:t>
+      </w:r>
+      <w:proofErr w:type="spellEnd"/>
+      <w:r>
+        <w:t xml:space="preserve"> = 0 ; </w:t>
+      </w:r>
+      <w:proofErr w:type="spellStart"/>
+      <w:r>
+        <w:t>i</w:t>
+      </w:r>
+      <w:proofErr w:type="spellEnd"/>
+      <w:r>
+        <w:t xml:space="preserve">&lt; </w:t>
+      </w:r>
+      <w:proofErr w:type="spellStart"/>
+      <w:r>
+        <w:t>arr.length</w:t>
+      </w:r>
+      <w:proofErr w:type="spellEnd"/>
+      <w:r>
+        <w:t xml:space="preserve"> ; </w:t>
+      </w:r>
+      <w:proofErr w:type="spellStart"/>
+      <w:r>
+        <w:t>i</w:t>
+      </w:r>
+      <w:proofErr w:type="spellEnd"/>
+      <w:r>
+        <w:t>++)</w:t>
+      </w:r>
+    </w:p>
+    <w:p>
+      <w:r>
+        <w:t>        {</w:t>
+      </w:r>
+    </w:p>
+    <w:p>
+      <w:r>
+        <w:t xml:space="preserve">            double qual = </w:t>
+      </w:r>
+      <w:proofErr w:type="spellStart"/>
+      <w:r>
+        <w:t>arr</w:t>
+      </w:r>
+      <w:proofErr w:type="spellEnd"/>
+      <w:r>
+        <w:t>[</w:t>
+      </w:r>
+      <w:proofErr w:type="spellStart"/>
+      <w:r>
+        <w:t>i</w:t>
+      </w:r>
+      <w:proofErr w:type="spellEnd"/>
+      <w:r>
+        <w:t>][0];</w:t>
+      </w:r>
+    </w:p>
+    <w:p>
+      <w:r>
+        <w:t xml:space="preserve">            double ratio = </w:t>
+      </w:r>
+      <w:proofErr w:type="spellStart"/>
+      <w:r>
+        <w:t>arr</w:t>
+      </w:r>
+      <w:proofErr w:type="spellEnd"/>
+      <w:r>
+        <w:t>[</w:t>
+      </w:r>
+      <w:proofErr w:type="spellStart"/>
+      <w:r>
+        <w:t>i</w:t>
+      </w:r>
+      <w:proofErr w:type="spellEnd"/>
+      <w:r>
+        <w:t>][1];</w:t>
+      </w:r>
+    </w:p>
+    <w:p>
+      <w:r>
+        <w:t xml:space="preserve">            </w:t>
+      </w:r>
+      <w:proofErr w:type="spellStart"/>
+      <w:r>
+        <w:t>pq.offer</w:t>
+      </w:r>
+      <w:proofErr w:type="spellEnd"/>
+      <w:r>
+        <w:t>(qual);</w:t>
+      </w:r>
+    </w:p>
+    <w:p>
+      <w:r>
+        <w:t>            total+=qual;</w:t>
+      </w:r>
+    </w:p>
+    <w:p>
+      <w:r>
+        <w:t>            if(</w:t>
+      </w:r>
+      <w:proofErr w:type="spellStart"/>
+      <w:r>
+        <w:t>pq.size</w:t>
+      </w:r>
+      <w:proofErr w:type="spellEnd"/>
+      <w:r>
+        <w:t>()&gt;k)</w:t>
+      </w:r>
+    </w:p>
+    <w:p>
+      <w:r>
+        <w:t>            {</w:t>
+      </w:r>
+    </w:p>
+    <w:p>
+      <w:r>
+        <w:t>                total-=</w:t>
+      </w:r>
+      <w:proofErr w:type="spellStart"/>
+      <w:r>
+        <w:t>pq.poll</w:t>
+      </w:r>
+      <w:proofErr w:type="spellEnd"/>
+      <w:r>
+        <w:t>();</w:t>
+      </w:r>
+    </w:p>
+    <w:p>
+      <w:r>
+        <w:t>            }</w:t>
+      </w:r>
+    </w:p>
+    <w:p/>
+    <w:p>
+      <w:r>
+        <w:t>            if(</w:t>
+      </w:r>
+      <w:proofErr w:type="spellStart"/>
+      <w:r>
+        <w:t>pq.size</w:t>
+      </w:r>
+      <w:proofErr w:type="spellEnd"/>
+      <w:r>
+        <w:t>()==k)</w:t>
+      </w:r>
+    </w:p>
+    <w:p>
+      <w:r>
+        <w:t>            {</w:t>
+      </w:r>
+    </w:p>
+    <w:p>
+      <w:r>
+        <w:t xml:space="preserve">                res = </w:t>
+      </w:r>
+      <w:proofErr w:type="spellStart"/>
+      <w:r>
+        <w:t>Math.min</w:t>
+      </w:r>
+      <w:proofErr w:type="spellEnd"/>
+      <w:r>
+        <w:t>(res , total*ratio);</w:t>
+      </w:r>
+    </w:p>
+    <w:p>
+      <w:r>
+        <w:t>            }</w:t>
+      </w:r>
+    </w:p>
+    <w:p>
+      <w:r>
+        <w:t>        }</w:t>
+      </w:r>
+    </w:p>
+    <w:p>
+      <w:r>
+        <w:t>        return res;</w:t>
+      </w:r>
+    </w:p>
+    <w:p>
+      <w:r>
+        <w:t>    }</w:t>
+      </w:r>
+    </w:p>
+    <w:p>
+      <w:r>
+        <w:t>}</w:t>
+      </w:r>
+    </w:p>
+    <w:p/>
+    <w:p/>
+    <w:p/>
+    <w:p/>
+    <w:p/>
+    <w:p/>
+    <w:p/>
+    <w:p/>
+    <w:p/>
+    <w:p>
+      <w:pPr>
+        <w:rPr>
+          <w:b/>
+          <w:bCs/>
+        </w:rPr>
+      </w:pPr>
+      <w:r>
+        <w:rPr>
+          <w:b/>
+          <w:bCs/>
+        </w:rPr>
+        <w:lastRenderedPageBreak/>
+        <w:t>LC#2402 MEETINGS ROOMS III</w:t>
+      </w:r>
+    </w:p>
+    <w:p>
+      <w:pPr>
+        <w:rPr>
+          <w:b/>
+          <w:bCs/>
+        </w:rPr>
+      </w:pPr>
+      <w:r>
+        <w:rPr>
+          <w:b/>
+          <w:bCs/>
+        </w:rPr>
+        <w:t xml:space="preserve">You are given an integer n. There </w:t>
+      </w:r>
+      <w:proofErr w:type="gramStart"/>
+      <w:r>
+        <w:rPr>
+          <w:b/>
+          <w:bCs/>
+        </w:rPr>
+        <w:t>are</w:t>
+      </w:r>
+      <w:proofErr w:type="gramEnd"/>
+      <w:r>
+        <w:rPr>
+          <w:b/>
+          <w:bCs/>
+        </w:rPr>
+        <w:t> n rooms numbered from 0 to n - 1.</w:t>
+      </w:r>
+    </w:p>
+    <w:p>
+      <w:pPr>
+        <w:rPr>
+          <w:b/>
+          <w:bCs/>
+        </w:rPr>
+      </w:pPr>
+      <w:r>
+        <w:rPr>
+          <w:b/>
+          <w:bCs/>
+        </w:rPr>
+        <w:t>You are given a 2D integer array meetings where meetings[</w:t>
+      </w:r>
+      <w:proofErr w:type="spellStart"/>
+      <w:r>
+        <w:rPr>
+          <w:b/>
+          <w:bCs/>
+        </w:rPr>
+        <w:t>i</w:t>
+      </w:r>
+      <w:proofErr w:type="spellEnd"/>
+      <w:r>
+        <w:rPr>
+          <w:b/>
+          <w:bCs/>
+        </w:rPr>
+        <w:t>] = [</w:t>
+      </w:r>
+      <w:proofErr w:type="spellStart"/>
+      <w:r>
+        <w:rPr>
+          <w:b/>
+          <w:bCs/>
+        </w:rPr>
+        <w:t>start</w:t>
+      </w:r>
+      <w:r>
+        <w:rPr>
+          <w:b/>
+          <w:bCs/>
+          <w:vertAlign w:val="subscript"/>
+        </w:rPr>
+        <w:t>i</w:t>
+      </w:r>
+      <w:proofErr w:type="spellEnd"/>
+      <w:r>
+        <w:rPr>
+          <w:b/>
+          <w:bCs/>
+        </w:rPr>
+        <w:t xml:space="preserve">, </w:t>
+      </w:r>
+      <w:proofErr w:type="spellStart"/>
+      <w:r>
+        <w:rPr>
+          <w:b/>
+          <w:bCs/>
+        </w:rPr>
+        <w:t>end</w:t>
+      </w:r>
+      <w:r>
+        <w:rPr>
+          <w:b/>
+          <w:bCs/>
+          <w:vertAlign w:val="subscript"/>
+        </w:rPr>
+        <w:t>i</w:t>
+      </w:r>
+      <w:proofErr w:type="spellEnd"/>
+      <w:r>
+        <w:rPr>
+          <w:b/>
+          <w:bCs/>
+        </w:rPr>
+        <w:t>] means that a meeting will be held during the half-closed time interval [</w:t>
+      </w:r>
+      <w:proofErr w:type="spellStart"/>
+      <w:r>
+        <w:rPr>
+          <w:b/>
+          <w:bCs/>
+        </w:rPr>
+        <w:t>start</w:t>
+      </w:r>
+      <w:r>
+        <w:rPr>
+          <w:b/>
+          <w:bCs/>
+          <w:vertAlign w:val="subscript"/>
+        </w:rPr>
+        <w:t>i</w:t>
+      </w:r>
+      <w:proofErr w:type="spellEnd"/>
+      <w:r>
+        <w:rPr>
+          <w:b/>
+          <w:bCs/>
+        </w:rPr>
+        <w:t xml:space="preserve">, </w:t>
+      </w:r>
+      <w:proofErr w:type="spellStart"/>
+      <w:r>
+        <w:rPr>
+          <w:b/>
+          <w:bCs/>
+        </w:rPr>
+        <w:t>end</w:t>
+      </w:r>
+      <w:r>
+        <w:rPr>
+          <w:b/>
+          <w:bCs/>
+          <w:vertAlign w:val="subscript"/>
+        </w:rPr>
+        <w:t>i</w:t>
+      </w:r>
+      <w:proofErr w:type="spellEnd"/>
+      <w:r>
+        <w:rPr>
+          <w:b/>
+          <w:bCs/>
+        </w:rPr>
+        <w:t>). All the values of </w:t>
+      </w:r>
+      <w:proofErr w:type="spellStart"/>
+      <w:r>
+        <w:rPr>
+          <w:b/>
+          <w:bCs/>
+        </w:rPr>
+        <w:t>start</w:t>
+      </w:r>
+      <w:r>
+        <w:rPr>
+          <w:b/>
+          <w:bCs/>
+          <w:vertAlign w:val="subscript"/>
+        </w:rPr>
+        <w:t>i</w:t>
+      </w:r>
+      <w:proofErr w:type="spellEnd"/>
+      <w:r>
+        <w:rPr>
+          <w:b/>
+          <w:bCs/>
+        </w:rPr>
+        <w:t> are unique.</w:t>
+      </w:r>
+    </w:p>
+    <w:p>
+      <w:pPr>
+        <w:rPr>
+          <w:b/>
+          <w:bCs/>
+        </w:rPr>
+      </w:pPr>
+      <w:r>
+        <w:rPr>
+          <w:b/>
+          <w:bCs/>
+        </w:rPr>
+        <w:t>Meetings are allocated to rooms in the following manner:</w:t>
+      </w:r>
+    </w:p>
+    <w:p>
+      <w:pPr>
+        <w:numPr>
+          <w:ilvl w:val="0"/>
+          <w:numId w:val="7"/>
+        </w:numPr>
+        <w:rPr>
+          <w:b/>
+          <w:bCs/>
+        </w:rPr>
+      </w:pPr>
+      <w:r>
+        <w:rPr>
+          <w:b/>
+          <w:bCs/>
+        </w:rPr>
+        <w:t>Each meeting will take place in the unused room with the lowest number.</w:t>
+      </w:r>
+    </w:p>
+    <w:p>
+      <w:pPr>
+        <w:numPr>
+          <w:ilvl w:val="0"/>
+          <w:numId w:val="7"/>
+        </w:numPr>
+        <w:rPr>
+          <w:b/>
+          <w:bCs/>
+        </w:rPr>
+      </w:pPr>
+      <w:r>
+        <w:rPr>
+          <w:b/>
+          <w:bCs/>
+        </w:rPr>
+        <w:t>If there are no available rooms, the meeting will be delayed until a room becomes free. The delayed meeting should have the same duration as the original meeting.</w:t>
+      </w:r>
+    </w:p>
+    <w:p>
+      <w:pPr>
+        <w:numPr>
+          <w:ilvl w:val="0"/>
+          <w:numId w:val="7"/>
+        </w:numPr>
+        <w:rPr>
+          <w:b/>
+          <w:bCs/>
+        </w:rPr>
+      </w:pPr>
+      <w:r>
+        <w:rPr>
+          <w:b/>
+          <w:bCs/>
+        </w:rPr>
+        <w:t>When a room becomes unused, meetings that have an earlier original start time should be given the room.</w:t>
+      </w:r>
+    </w:p>
+    <w:p>
+      <w:pPr>
+        <w:rPr>
+          <w:b/>
+          <w:bCs/>
+        </w:rPr>
+      </w:pPr>
+      <w:r>
+        <w:rPr>
+          <w:b/>
+          <w:bCs/>
+        </w:rPr>
+        <w:t>Return</w:t>
+      </w:r>
+      <w:r>
+        <w:rPr>
+          <w:b/>
+          <w:bCs/>
+          <w:i/>
+          <w:iCs/>
+        </w:rPr>
+        <w:t> the number of the room that held the most meetings. </w:t>
+      </w:r>
+      <w:r>
+        <w:rPr>
+          <w:b/>
+          <w:bCs/>
+        </w:rPr>
+        <w:t>If there are multiple rooms, return</w:t>
+      </w:r>
+      <w:r>
+        <w:rPr>
+          <w:b/>
+          <w:bCs/>
+          <w:i/>
+          <w:iCs/>
+        </w:rPr>
+        <w:t> the room with the lowest number.</w:t>
+      </w:r>
+    </w:p>
+    <w:p>
+      <w:pPr>
+        <w:rPr>
+          <w:b/>
+          <w:bCs/>
+        </w:rPr>
+      </w:pPr>
+      <w:r>
+        <w:rPr>
+          <w:b/>
+          <w:bCs/>
+        </w:rPr>
+        <w:t>A half-closed interval [a, b) is the interval between a and b including a and not including b.</w:t>
+      </w:r>
+    </w:p>
+    <w:p>
+      <w:pPr>
+        <w:rPr>
+          <w:b/>
+          <w:bCs/>
+        </w:rPr>
+      </w:pPr>
+      <w:r>
+        <w:rPr>
+          <w:b/>
+          <w:bCs/>
+        </w:rPr>
+        <w:t> </w:t>
+      </w:r>
+    </w:p>
+    <w:p>
+      <w:pPr>
+        <w:rPr>
+          <w:b/>
+          <w:bCs/>
+        </w:rPr>
+      </w:pPr>
+      <w:r>
+        <w:rPr>
+          <w:b/>
+          <w:bCs/>
+        </w:rPr>
+        <w:t>Example 1:</w:t>
+      </w:r>
+    </w:p>
+    <w:p>
+      <w:pPr>
+        <w:rPr>
+          <w:b/>
+          <w:bCs/>
+        </w:rPr>
+      </w:pPr>
+      <w:r>
+        <w:rPr>
+          <w:b/>
+          <w:bCs/>
+        </w:rPr>
+        <w:t>Input: n = 2, meetings = [[0,10],[1,5],[2,7],[3,4]]</w:t>
+      </w:r>
+    </w:p>
+    <w:p>
+      <w:pPr>
+        <w:rPr>
+          <w:b/>
+          <w:bCs/>
+        </w:rPr>
+      </w:pPr>
+      <w:r>
+        <w:rPr>
+          <w:b/>
+          <w:bCs/>
+        </w:rPr>
+        <w:t>Output: 0</w:t>
+      </w:r>
+    </w:p>
+    <w:p>
+      <w:pPr>
+        <w:rPr>
+          <w:b/>
+          <w:bCs/>
+        </w:rPr>
+      </w:pPr>
+      <w:r>
+        <w:rPr>
+          <w:b/>
+          <w:bCs/>
+        </w:rPr>
+        <w:t>Explanation:</w:t>
+      </w:r>
+    </w:p>
+    <w:p>
+      <w:pPr>
+        <w:rPr>
+          <w:b/>
+          <w:bCs/>
+        </w:rPr>
+      </w:pPr>
+      <w:r>
+        <w:rPr>
+          <w:b/>
+          <w:bCs/>
+        </w:rPr>
+        <w:t>- At time 0, both rooms are not being used. The first meeting starts in room 0.</w:t>
+      </w:r>
+    </w:p>
+    <w:p>
+      <w:pPr>
+        <w:rPr>
+          <w:b/>
+          <w:bCs/>
+        </w:rPr>
+      </w:pPr>
+      <w:r>
+        <w:rPr>
+          <w:b/>
+          <w:bCs/>
+        </w:rPr>
+        <w:t>- At time 1, only room 1 is not being used. The second meeting starts in room 1.</w:t>
+      </w:r>
+    </w:p>
+    <w:p>
+      <w:pPr>
+        <w:rPr>
+          <w:b/>
+          <w:bCs/>
+        </w:rPr>
+      </w:pPr>
+      <w:r>
+        <w:rPr>
+          <w:b/>
+          <w:bCs/>
+        </w:rPr>
+        <w:t>- At time 2, both rooms are being used. The third meeting is delayed.</w:t>
+      </w:r>
+    </w:p>
+    <w:p>
+      <w:pPr>
+        <w:rPr>
+          <w:b/>
+          <w:bCs/>
+        </w:rPr>
+      </w:pPr>
+      <w:r>
+        <w:rPr>
+          <w:b/>
+          <w:bCs/>
+        </w:rPr>
+        <w:t>- At time 3, both rooms are being used. The fourth meeting is delayed.</w:t>
+      </w:r>
+    </w:p>
+    <w:p>
+      <w:pPr>
+        <w:rPr>
+          <w:b/>
+          <w:bCs/>
+        </w:rPr>
+      </w:pPr>
+      <w:r>
+        <w:rPr>
+          <w:b/>
+          <w:bCs/>
+        </w:rPr>
+        <w:t>- At time 5, the meeting in room 1 finishes. The third meeting starts in room 1 for the time period [5,10).</w:t>
+      </w:r>
+    </w:p>
+    <w:p>
+      <w:pPr>
+        <w:rPr>
+          <w:b/>
+          <w:bCs/>
+        </w:rPr>
+      </w:pPr>
+      <w:r>
+        <w:rPr>
+          <w:b/>
+          <w:bCs/>
+        </w:rPr>
+        <w:t>- At time 10, the meetings in both rooms finish. The fourth meeting starts in room 0 for the time period [10,11).</w:t>
+      </w:r>
+    </w:p>
+    <w:p>
+      <w:pPr>
+        <w:rPr>
+          <w:b/>
+          <w:bCs/>
+        </w:rPr>
+      </w:pPr>
+      <w:r>
+        <w:rPr>
+          <w:b/>
+          <w:bCs/>
+        </w:rPr>
+        <w:t xml:space="preserve">Both rooms 0 and 1 held 2 meetings, so we return 0. </w:t>
+      </w:r>
+    </w:p>
+    <w:p>
+      <w:pPr>
+        <w:rPr>
+          <w:b/>
+          <w:bCs/>
+        </w:rPr>
+      </w:pPr>
+    </w:p>
+    <w:p>
+      <w:pPr>
+        <w:rPr>
+          <w:b/>
+          <w:bCs/>
+        </w:rPr>
+      </w:pPr>
+    </w:p>
+    <w:p>
+      <w:pPr>
+        <w:rPr>
+          <w:b/>
+          <w:bCs/>
+        </w:rPr>
+      </w:pPr>
+      <w:r>
+        <w:rPr>
+          <w:b/>
+          <w:bCs/>
+        </w:rPr>
+        <w:lastRenderedPageBreak/>
+        <w:t>APP:</w:t>
+      </w:r>
+    </w:p>
+    <w:p>
+      <w:pPr>
+        <w:rPr>
+          <w:b/>
+          <w:bCs/>
+        </w:rPr>
+      </w:pPr>
+      <w:r>
+        <w:rPr>
+          <w:b/>
+          <w:bCs/>
+        </w:rPr>
+        <w:t>-&gt; every meeting has to happen in  order so sort by starting time</w:t>
+      </w:r>
+    </w:p>
+    <w:p>
+      <w:pPr>
+        <w:rPr>
+          <w:b/>
+          <w:bCs/>
+        </w:rPr>
+      </w:pPr>
+      <w:r>
+        <w:rPr>
+          <w:b/>
+          <w:bCs/>
+        </w:rPr>
+        <w:t xml:space="preserve">-&gt; have two heaps one to allocate room(min heap) another to keep track of the busy rooms (min heap) but two conditions if start==end then put based on room number use </w:t>
+      </w:r>
+      <w:proofErr w:type="spellStart"/>
+      <w:r>
+        <w:rPr>
+          <w:b/>
+          <w:bCs/>
+        </w:rPr>
+        <w:t>long.compare</w:t>
+      </w:r>
+      <w:proofErr w:type="spellEnd"/>
+      <w:r>
+        <w:rPr>
+          <w:b/>
+          <w:bCs/>
+        </w:rPr>
+        <w:t xml:space="preserve"> </w:t>
+      </w:r>
+      <w:r>
+        <w:rPr>
+          <w:b/>
+          <w:bCs/>
+        </w:rPr>
+        <w:t>everywhere to avoid overflow</w:t>
+      </w:r>
+    </w:p>
+    <w:p>
+      <w:pPr>
+        <w:rPr>
+          <w:b/>
+          <w:bCs/>
+        </w:rPr>
+      </w:pPr>
+      <w:r>
+        <w:rPr>
+          <w:b/>
+          <w:bCs/>
+        </w:rPr>
+        <w:t>-&gt;in the code the important phases are freeing the room and delaying the end time</w:t>
+      </w:r>
+    </w:p>
+    <w:p>
+      <w:pPr>
+        <w:rPr>
+          <w:b/>
+          <w:bCs/>
+        </w:rPr>
+      </w:pPr>
+      <w:r>
+        <w:rPr>
+          <w:b/>
+          <w:bCs/>
+        </w:rPr>
+        <w:t xml:space="preserve">-&gt;finally find the room </w:t>
+      </w:r>
+      <w:proofErr w:type="spellStart"/>
+      <w:r>
+        <w:rPr>
+          <w:b/>
+          <w:bCs/>
+        </w:rPr>
+        <w:t>whch</w:t>
+      </w:r>
+      <w:proofErr w:type="spellEnd"/>
+      <w:r>
+        <w:rPr>
+          <w:b/>
+          <w:bCs/>
+        </w:rPr>
+        <w:t xml:space="preserve"> has the max number of </w:t>
+      </w:r>
+      <w:proofErr w:type="gramStart"/>
+      <w:r>
+        <w:rPr>
+          <w:b/>
+          <w:bCs/>
+        </w:rPr>
+        <w:t>usage</w:t>
+      </w:r>
+      <w:proofErr w:type="gramEnd"/>
+    </w:p>
+    <w:p>
+      <w:pPr>
+        <w:rPr>
+          <w:b/>
+          <w:bCs/>
+        </w:rPr>
+      </w:pPr>
+      <w:r>
+        <w:rPr>
+          <w:b/>
+          <w:bCs/>
+        </w:rPr>
+        <w:t>CODE:</w:t>
+      </w:r>
+    </w:p>
+    <w:p>
+      <w:r>
+        <w:t>class Solution {</w:t>
+      </w:r>
+    </w:p>
+    <w:p>
+      <w:r>
+        <w:t xml:space="preserve">    public int </w:t>
+      </w:r>
+      <w:proofErr w:type="spellStart"/>
+      <w:r>
+        <w:t>mostBooked</w:t>
+      </w:r>
+      <w:proofErr w:type="spellEnd"/>
+      <w:r>
+        <w:t>(int n, int[][] meetings) {</w:t>
+      </w:r>
+    </w:p>
+    <w:p>
+      <w:r>
+        <w:t>        int count[] = new int[n];</w:t>
+      </w:r>
+    </w:p>
+    <w:p>
+      <w:r>
+        <w:t xml:space="preserve">        </w:t>
+      </w:r>
+      <w:proofErr w:type="spellStart"/>
+      <w:r>
+        <w:t>PriorityQueue</w:t>
+      </w:r>
+      <w:proofErr w:type="spellEnd"/>
+      <w:r>
+        <w:t xml:space="preserve">&lt;Integer&gt; free = new </w:t>
+      </w:r>
+      <w:proofErr w:type="spellStart"/>
+      <w:r>
+        <w:t>PriorityQueue</w:t>
+      </w:r>
+      <w:proofErr w:type="spellEnd"/>
+      <w:r>
+        <w:t>&lt;&gt;();</w:t>
+      </w:r>
+    </w:p>
+    <w:p>
+      <w:r>
+        <w:t xml:space="preserve">        for(int </w:t>
+      </w:r>
+      <w:proofErr w:type="spellStart"/>
+      <w:r>
+        <w:t>i</w:t>
+      </w:r>
+      <w:proofErr w:type="spellEnd"/>
+      <w:r>
+        <w:t xml:space="preserve"> = 0 ; </w:t>
+      </w:r>
+      <w:proofErr w:type="spellStart"/>
+      <w:r>
+        <w:t>i</w:t>
+      </w:r>
+      <w:proofErr w:type="spellEnd"/>
+      <w:r>
+        <w:t xml:space="preserve">&lt;n ; </w:t>
+      </w:r>
+      <w:proofErr w:type="spellStart"/>
+      <w:r>
+        <w:t>i</w:t>
+      </w:r>
+      <w:proofErr w:type="spellEnd"/>
+      <w:r>
+        <w:t>++)</w:t>
+      </w:r>
+    </w:p>
+    <w:p>
+      <w:r>
+        <w:t xml:space="preserve">            </w:t>
+      </w:r>
+      <w:proofErr w:type="spellStart"/>
+      <w:r>
+        <w:t>free.offer</w:t>
+      </w:r>
+      <w:proofErr w:type="spellEnd"/>
+      <w:r>
+        <w:t>(</w:t>
+      </w:r>
+      <w:proofErr w:type="spellStart"/>
+      <w:r>
+        <w:t>i</w:t>
+      </w:r>
+      <w:proofErr w:type="spellEnd"/>
+      <w:r>
+        <w:t>)</w:t>
+      </w:r>
+      <w:r>
+        <w:t>;</w:t>
+      </w:r>
+    </w:p>
+    <w:p>
+      <w:r>
+        <w:t xml:space="preserve">        </w:t>
+      </w:r>
+      <w:proofErr w:type="spellStart"/>
+      <w:r>
+        <w:t>Arrays.sort</w:t>
+      </w:r>
+      <w:proofErr w:type="spellEnd"/>
+      <w:r>
+        <w:t>(meetings,(</w:t>
+      </w:r>
+      <w:proofErr w:type="spellStart"/>
+      <w:r>
+        <w:t>a,b</w:t>
+      </w:r>
+      <w:proofErr w:type="spellEnd"/>
+      <w:r>
+        <w:t>)-&gt;</w:t>
+      </w:r>
+      <w:proofErr w:type="spellStart"/>
+      <w:r>
+        <w:t>Integer.compare</w:t>
+      </w:r>
+      <w:proofErr w:type="spellEnd"/>
+      <w:r>
+        <w:t>(a[0],b[0]));//start time</w:t>
+      </w:r>
+    </w:p>
+    <w:p/>
+    <w:p>
+      <w:pPr>
+        <w:rPr>
+          <w:b/>
+          <w:bCs/>
+        </w:rPr>
+      </w:pPr>
+      <w:r>
+        <w:t xml:space="preserve">        </w:t>
+      </w:r>
+      <w:proofErr w:type="spellStart"/>
+      <w:r>
+        <w:rPr>
+          <w:b/>
+          <w:bCs/>
+        </w:rPr>
+        <w:t>PriorityQueue</w:t>
+      </w:r>
+      <w:proofErr w:type="spellEnd"/>
+      <w:r>
+        <w:rPr>
+          <w:b/>
+          <w:bCs/>
+        </w:rPr>
+        <w:t xml:space="preserve">&lt;long[]&gt; busy = new </w:t>
+      </w:r>
+      <w:proofErr w:type="spellStart"/>
+      <w:r>
+        <w:rPr>
+          <w:b/>
+          <w:bCs/>
+        </w:rPr>
+        <w:t>PriorityQueue</w:t>
+      </w:r>
+      <w:proofErr w:type="spellEnd"/>
+      <w:r>
+        <w:rPr>
+          <w:b/>
+          <w:bCs/>
+        </w:rPr>
+        <w:t>&lt;&gt;</w:t>
+      </w:r>
+    </w:p>
+    <w:p>
+      <w:pPr>
+        <w:rPr>
+          <w:b/>
+          <w:bCs/>
+        </w:rPr>
+      </w:pPr>
+      <w:r>
+        <w:rPr>
+          <w:b/>
+          <w:bCs/>
+        </w:rPr>
+        <w:t>        ((</w:t>
+      </w:r>
+      <w:proofErr w:type="spellStart"/>
+      <w:r>
+        <w:rPr>
+          <w:b/>
+          <w:bCs/>
+        </w:rPr>
+        <w:t>a,b</w:t>
+      </w:r>
+      <w:proofErr w:type="spellEnd"/>
+      <w:r>
+        <w:rPr>
+          <w:b/>
+          <w:bCs/>
+        </w:rPr>
+        <w:t>)-&gt;</w:t>
+      </w:r>
+      <w:proofErr w:type="spellStart"/>
+      <w:r>
+        <w:rPr>
+          <w:b/>
+          <w:bCs/>
+        </w:rPr>
+        <w:t>Long.compare</w:t>
+      </w:r>
+      <w:proofErr w:type="spellEnd"/>
+      <w:r>
+        <w:rPr>
+          <w:b/>
+          <w:bCs/>
+        </w:rPr>
+        <w:t>(a[0], b[0])!=0?</w:t>
+      </w:r>
+    </w:p>
+    <w:p>
+      <w:pPr>
+        <w:rPr>
+          <w:b/>
+          <w:bCs/>
+        </w:rPr>
+      </w:pPr>
+      <w:r>
+        <w:rPr>
+          <w:b/>
+          <w:bCs/>
+        </w:rPr>
+        <w:t xml:space="preserve">        </w:t>
+      </w:r>
+      <w:proofErr w:type="spellStart"/>
+      <w:r>
+        <w:rPr>
+          <w:b/>
+          <w:bCs/>
+        </w:rPr>
+        <w:t>Long.compare</w:t>
+      </w:r>
+      <w:proofErr w:type="spellEnd"/>
+      <w:r>
+        <w:rPr>
+          <w:b/>
+          <w:bCs/>
+        </w:rPr>
+        <w:t>(a[0], b[0]):</w:t>
+      </w:r>
+      <w:proofErr w:type="spellStart"/>
+      <w:r>
+        <w:rPr>
+          <w:b/>
+          <w:bCs/>
+        </w:rPr>
+        <w:t>Long.compare</w:t>
+      </w:r>
+      <w:proofErr w:type="spellEnd"/>
+      <w:r>
+        <w:rPr>
+          <w:b/>
+          <w:bCs/>
+        </w:rPr>
+        <w:t>(a[1],b[1]));</w:t>
+      </w:r>
+      <w:r>
+        <w:rPr>
+          <w:b/>
+          <w:bCs/>
+        </w:rPr>
+        <w:t xml:space="preserve">//without this </w:t>
+      </w:r>
+      <w:proofErr w:type="spellStart"/>
+      <w:r>
+        <w:rPr>
+          <w:b/>
+          <w:bCs/>
+        </w:rPr>
+        <w:t>wont</w:t>
+      </w:r>
+      <w:proofErr w:type="spellEnd"/>
+      <w:r>
+        <w:rPr>
+          <w:b/>
+          <w:bCs/>
+        </w:rPr>
+        <w:t xml:space="preserve"> work</w:t>
+      </w:r>
+    </w:p>
+    <w:p/>
+    <w:p>
+      <w:r>
+        <w:t>        for(int m[]  : meetings)</w:t>
+      </w:r>
+    </w:p>
+    <w:p>
+      <w:r>
+        <w:t>        {</w:t>
+      </w:r>
+    </w:p>
+    <w:p>
+      <w:r>
+        <w:t>            long start = m[0];</w:t>
+      </w:r>
+    </w:p>
+    <w:p>
+      <w:r>
+        <w:t>            long end = m[1];</w:t>
+      </w:r>
+    </w:p>
+    <w:p/>
+    <w:p>
+      <w:r>
+        <w:t>            while(!</w:t>
+      </w:r>
+      <w:proofErr w:type="spellStart"/>
+      <w:r>
+        <w:t>busy.isEmpty</w:t>
+      </w:r>
+      <w:proofErr w:type="spellEnd"/>
+      <w:r>
+        <w:t xml:space="preserve">() &amp;&amp; </w:t>
+      </w:r>
+      <w:proofErr w:type="spellStart"/>
+      <w:r>
+        <w:t>busy.peek</w:t>
+      </w:r>
+      <w:proofErr w:type="spellEnd"/>
+      <w:r>
+        <w:t>()[0]&lt;=start)</w:t>
+      </w:r>
+    </w:p>
+    <w:p>
+      <w:r>
+        <w:t xml:space="preserve">            {//checking like the busy rooms end &lt;= </w:t>
+      </w:r>
+      <w:proofErr w:type="spellStart"/>
+      <w:r>
+        <w:t>curr</w:t>
+      </w:r>
+      <w:proofErr w:type="spellEnd"/>
+      <w:r>
+        <w:t xml:space="preserve"> start if so free the room</w:t>
+      </w:r>
+    </w:p>
+    <w:p>
+      <w:r>
+        <w:t xml:space="preserve">                int </w:t>
+      </w:r>
+      <w:proofErr w:type="spellStart"/>
+      <w:r>
+        <w:t>freeroom</w:t>
+      </w:r>
+      <w:proofErr w:type="spellEnd"/>
+      <w:r>
+        <w:t xml:space="preserve"> = (int)</w:t>
+      </w:r>
+      <w:proofErr w:type="spellStart"/>
+      <w:r>
+        <w:t>busy.poll</w:t>
+      </w:r>
+      <w:proofErr w:type="spellEnd"/>
+      <w:r>
+        <w:t>()[1];</w:t>
+      </w:r>
+    </w:p>
+    <w:p>
+      <w:r>
+        <w:t xml:space="preserve">                </w:t>
+      </w:r>
+      <w:proofErr w:type="spellStart"/>
+      <w:r>
+        <w:t>free.offer</w:t>
+      </w:r>
+      <w:proofErr w:type="spellEnd"/>
+      <w:r>
+        <w:t>(</w:t>
+      </w:r>
+      <w:proofErr w:type="spellStart"/>
+      <w:r>
+        <w:t>freeroom</w:t>
+      </w:r>
+      <w:proofErr w:type="spellEnd"/>
+      <w:r>
+        <w:t>);</w:t>
+      </w:r>
+    </w:p>
+    <w:p>
+      <w:r>
+        <w:lastRenderedPageBreak/>
+        <w:t>            }</w:t>
+      </w:r>
+    </w:p>
+    <w:p/>
+    <w:p>
+      <w:r>
+        <w:t>            if(!</w:t>
+      </w:r>
+      <w:proofErr w:type="spellStart"/>
+      <w:r>
+        <w:t>free.isEmpty</w:t>
+      </w:r>
+      <w:proofErr w:type="spellEnd"/>
+      <w:r>
+        <w:t>())//if room avail for meeting</w:t>
+      </w:r>
+    </w:p>
+    <w:p>
+      <w:r>
+        <w:t>            {</w:t>
+      </w:r>
+    </w:p>
+    <w:p>
+      <w:pPr>
+        <w:rPr>
+          <w:b/>
+          <w:bCs/>
+        </w:rPr>
+      </w:pPr>
+      <w:r>
+        <w:t xml:space="preserve">                long </w:t>
+      </w:r>
+      <w:proofErr w:type="spellStart"/>
+      <w:r>
+        <w:t>notOcc</w:t>
+      </w:r>
+      <w:proofErr w:type="spellEnd"/>
+      <w:r>
+        <w:t xml:space="preserve"> = (long)</w:t>
+      </w:r>
+      <w:proofErr w:type="spellStart"/>
+      <w:r>
+        <w:t>free.poll</w:t>
+      </w:r>
+      <w:proofErr w:type="spellEnd"/>
+      <w:r>
+        <w:t>();</w:t>
+      </w:r>
+      <w:r>
+        <w:rPr>
+          <w:b/>
+          <w:bCs/>
+        </w:rPr>
+        <w:t xml:space="preserve">//getting the room </w:t>
+      </w:r>
+    </w:p>
+    <w:p>
+      <w:r>
+        <w:t xml:space="preserve">                </w:t>
+      </w:r>
+      <w:proofErr w:type="spellStart"/>
+      <w:r>
+        <w:t>busy.offer</w:t>
+      </w:r>
+      <w:proofErr w:type="spellEnd"/>
+      <w:r>
+        <w:t>(new long[]{end ,</w:t>
+      </w:r>
+      <w:proofErr w:type="spellStart"/>
+      <w:r>
+        <w:t>notOcc</w:t>
+      </w:r>
+      <w:proofErr w:type="spellEnd"/>
+      <w:r>
+        <w:t>});</w:t>
+      </w:r>
+    </w:p>
+    <w:p>
+      <w:r>
+        <w:t>                count[(int)</w:t>
+      </w:r>
+      <w:proofErr w:type="spellStart"/>
+      <w:r>
+        <w:t>notOcc</w:t>
+      </w:r>
+      <w:proofErr w:type="spellEnd"/>
+      <w:r>
+        <w:t>]++;</w:t>
+      </w:r>
+    </w:p>
+    <w:p>
+      <w:r>
+        <w:t>            }</w:t>
+      </w:r>
+    </w:p>
+    <w:p>
+      <w:r>
+        <w:t>            else //no room for meeting</w:t>
+      </w:r>
+    </w:p>
+    <w:p>
+      <w:r>
+        <w:t>            {</w:t>
+      </w:r>
+    </w:p>
+    <w:p>
+      <w:r>
+        <w:t>                //we are going to update the end time in the heap</w:t>
+      </w:r>
+    </w:p>
+    <w:p>
+      <w:r>
+        <w:t xml:space="preserve">                long next[] = </w:t>
+      </w:r>
+      <w:proofErr w:type="spellStart"/>
+      <w:r>
+        <w:t>busy.poll</w:t>
+      </w:r>
+      <w:proofErr w:type="spellEnd"/>
+      <w:r>
+        <w:t>();</w:t>
+      </w:r>
+    </w:p>
+    <w:p>
+      <w:r>
+        <w:t>                next[0] = next[0]+end-start;</w:t>
+      </w:r>
+    </w:p>
+    <w:p>
+      <w:r>
+        <w:t xml:space="preserve">                </w:t>
+      </w:r>
+      <w:proofErr w:type="spellStart"/>
+      <w:r>
+        <w:t>busy.offer</w:t>
+      </w:r>
+      <w:proofErr w:type="spellEnd"/>
+      <w:r>
+        <w:t>(next);</w:t>
+      </w:r>
+    </w:p>
+    <w:p>
+      <w:r>
+        <w:t>                count[(int)next[1]]++;</w:t>
+      </w:r>
+    </w:p>
+    <w:p>
+      <w:r>
+        <w:t>            }</w:t>
+      </w:r>
+    </w:p>
+    <w:p>
+      <w:r>
+        <w:t>        }</w:t>
+      </w:r>
+    </w:p>
+    <w:p>
+      <w:r>
+        <w:t>        int res = 0 , max = 0;</w:t>
+      </w:r>
+    </w:p>
+    <w:p>
+      <w:r>
+        <w:t xml:space="preserve">        for(int </w:t>
+      </w:r>
+      <w:proofErr w:type="spellStart"/>
+      <w:r>
+        <w:t>i</w:t>
+      </w:r>
+      <w:proofErr w:type="spellEnd"/>
+      <w:r>
+        <w:t xml:space="preserve"> = 0 ; </w:t>
+      </w:r>
+      <w:proofErr w:type="spellStart"/>
+      <w:r>
+        <w:t>i</w:t>
+      </w:r>
+      <w:proofErr w:type="spellEnd"/>
+      <w:r>
+        <w:t xml:space="preserve">&lt; n ; </w:t>
+      </w:r>
+      <w:proofErr w:type="spellStart"/>
+      <w:r>
+        <w:t>i</w:t>
+      </w:r>
+      <w:proofErr w:type="spellEnd"/>
+      <w:r>
+        <w:t>++)</w:t>
+      </w:r>
+    </w:p>
+    <w:p>
+      <w:r>
+        <w:t>        {</w:t>
+      </w:r>
+    </w:p>
+    <w:p>
+      <w:r>
+        <w:t>            if(count[</w:t>
+      </w:r>
+      <w:proofErr w:type="spellStart"/>
+      <w:r>
+        <w:t>i</w:t>
+      </w:r>
+      <w:proofErr w:type="spellEnd"/>
+      <w:r>
+        <w:t>]&gt;max)</w:t>
+      </w:r>
+    </w:p>
+    <w:p>
+      <w:r>
+        <w:t>            {</w:t>
+      </w:r>
+    </w:p>
+    <w:p>
+      <w:r>
+        <w:t>                max = count[</w:t>
+      </w:r>
+      <w:proofErr w:type="spellStart"/>
+      <w:r>
+        <w:t>i</w:t>
+      </w:r>
+      <w:proofErr w:type="spellEnd"/>
+      <w:r>
+        <w:t>];</w:t>
+      </w:r>
+    </w:p>
+    <w:p>
+      <w:r>
+        <w:t xml:space="preserve">                res = </w:t>
+      </w:r>
+      <w:proofErr w:type="spellStart"/>
+      <w:r>
+        <w:t>i</w:t>
+      </w:r>
+      <w:proofErr w:type="spellEnd"/>
+      <w:r>
+        <w:t>;</w:t>
+      </w:r>
+    </w:p>
+    <w:p>
+      <w:r>
+        <w:t>            }</w:t>
+      </w:r>
+    </w:p>
+    <w:p>
+      <w:r>
+        <w:t>        }</w:t>
+      </w:r>
+    </w:p>
+    <w:p>
+      <w:r>
+        <w:t xml:space="preserve">        return res;   </w:t>
+      </w:r>
+    </w:p>
+    <w:p>
+      <w:r>
+        <w:t>    }</w:t>
+      </w:r>
+      <w:r>
+        <w:t>}</w:t>
+      </w:r>
+    </w:p>
+    <w:p>
+      <w:pPr>
+        <w:rPr>
+          <w:b/>
+          <w:bCs/>
+        </w:rPr>
+      </w:pPr>
+      <w:r>
+        <w:rPr>
+          <w:b/>
+          <w:bCs/>
+        </w:rPr>
+        <w:lastRenderedPageBreak/>
+        <w:t>There is a party where n friends numbered from 0 to n - 1 are attending. There is an infinite number of chairs in this party that are numbered from 0 to infinity. When a friend arrives at the party, they sit on the unoccupied chair with the smallest number.</w:t>
+      </w:r>
+    </w:p>
+    <w:p>
+      <w:pPr>
+        <w:numPr>
+          <w:ilvl w:val="0"/>
+          <w:numId w:val="8"/>
+        </w:numPr>
+        <w:rPr>
+          <w:b/>
+          <w:bCs/>
+        </w:rPr>
+      </w:pPr>
+      <w:r>
+        <w:rPr>
+          <w:b/>
+          <w:bCs/>
+        </w:rPr>
+        <w:t>For example, if chairs 0, 1, and 5 are occupied when a friend comes, they will sit on chair number 2.</w:t>
+      </w:r>
+    </w:p>
+    <w:p>
+      <w:pPr>
+        <w:rPr>
+          <w:b/>
+          <w:bCs/>
+        </w:rPr>
+      </w:pPr>
+      <w:r>
+        <w:rPr>
+          <w:b/>
+          <w:bCs/>
+        </w:rPr>
+        <w:t>When a friend leaves the party, their chair becomes unoccupied at the moment they leave. If another friend arrives at that same moment, they can sit in that chair.</w:t>
+      </w:r>
+    </w:p>
+    <w:p>
+      <w:pPr>
+        <w:rPr>
+          <w:b/>
+          <w:bCs/>
+        </w:rPr>
+      </w:pPr>
+      <w:r>
+        <w:rPr>
+          <w:b/>
+          <w:bCs/>
+        </w:rPr>
+        <w:t xml:space="preserve">You are given </w:t>
+      </w:r>
+      <w:proofErr w:type="gramStart"/>
+      <w:r>
+        <w:rPr>
+          <w:b/>
+          <w:bCs/>
+        </w:rPr>
+        <w:t>a 0-indexed 2D integer array times</w:t>
+      </w:r>
+      <w:proofErr w:type="gramEnd"/>
+      <w:r>
+        <w:rPr>
+          <w:b/>
+          <w:bCs/>
+        </w:rPr>
+        <w:t> where times[</w:t>
+      </w:r>
+      <w:proofErr w:type="spellStart"/>
+      <w:r>
+        <w:rPr>
+          <w:b/>
+          <w:bCs/>
+        </w:rPr>
+        <w:t>i</w:t>
+      </w:r>
+      <w:proofErr w:type="spellEnd"/>
+      <w:r>
+        <w:rPr>
+          <w:b/>
+          <w:bCs/>
+        </w:rPr>
+        <w:t>] = [</w:t>
+      </w:r>
+      <w:proofErr w:type="spellStart"/>
+      <w:r>
+        <w:rPr>
+          <w:b/>
+          <w:bCs/>
+        </w:rPr>
+        <w:t>arrival</w:t>
+      </w:r>
+      <w:r>
+        <w:rPr>
+          <w:b/>
+          <w:bCs/>
+          <w:vertAlign w:val="subscript"/>
+        </w:rPr>
+        <w:t>i</w:t>
+      </w:r>
+      <w:proofErr w:type="spellEnd"/>
+      <w:r>
+        <w:rPr>
+          <w:b/>
+          <w:bCs/>
+        </w:rPr>
+        <w:t xml:space="preserve">, </w:t>
+      </w:r>
+      <w:proofErr w:type="spellStart"/>
+      <w:r>
+        <w:rPr>
+          <w:b/>
+          <w:bCs/>
+        </w:rPr>
+        <w:t>leaving</w:t>
+      </w:r>
+      <w:r>
+        <w:rPr>
+          <w:b/>
+          <w:bCs/>
+          <w:vertAlign w:val="subscript"/>
+        </w:rPr>
+        <w:t>i</w:t>
+      </w:r>
+      <w:proofErr w:type="spellEnd"/>
+      <w:r>
+        <w:rPr>
+          <w:b/>
+          <w:bCs/>
+        </w:rPr>
+        <w:t>], indicating the arrival and leaving times of the </w:t>
+      </w:r>
+      <w:proofErr w:type="spellStart"/>
+      <w:r>
+        <w:rPr>
+          <w:b/>
+          <w:bCs/>
+        </w:rPr>
+        <w:t>i</w:t>
+      </w:r>
+      <w:r>
+        <w:rPr>
+          <w:b/>
+          <w:bCs/>
+          <w:vertAlign w:val="superscript"/>
+        </w:rPr>
+        <w:t>th</w:t>
+      </w:r>
+      <w:proofErr w:type="spellEnd"/>
+      <w:r>
+        <w:rPr>
+          <w:b/>
+          <w:bCs/>
+        </w:rPr>
+        <w:t> friend respectively, and an integer </w:t>
+      </w:r>
+      <w:proofErr w:type="spellStart"/>
+      <w:r>
+        <w:rPr>
+          <w:b/>
+          <w:bCs/>
+        </w:rPr>
+        <w:t>targetFriend</w:t>
+      </w:r>
+      <w:proofErr w:type="spellEnd"/>
+      <w:r>
+        <w:rPr>
+          <w:b/>
+          <w:bCs/>
+        </w:rPr>
+        <w:t>. All arrival times are distinct.</w:t>
+      </w:r>
+    </w:p>
+    <w:p>
+      <w:pPr>
+        <w:rPr>
+          <w:b/>
+          <w:bCs/>
+        </w:rPr>
+      </w:pPr>
+      <w:r>
+        <w:rPr>
+          <w:b/>
+          <w:bCs/>
+        </w:rPr>
+        <w:t>Return</w:t>
+      </w:r>
+      <w:r>
+        <w:rPr>
+          <w:b/>
+          <w:bCs/>
+          <w:i/>
+          <w:iCs/>
+        </w:rPr>
+        <w:t> the chair number that the friend numbered </w:t>
+      </w:r>
+      <w:proofErr w:type="spellStart"/>
+      <w:r>
+        <w:rPr>
+          <w:b/>
+          <w:bCs/>
+        </w:rPr>
+        <w:t>targetFriend</w:t>
+      </w:r>
+      <w:proofErr w:type="spellEnd"/>
+      <w:r>
+        <w:rPr>
+          <w:b/>
+          <w:bCs/>
+          <w:i/>
+          <w:iCs/>
+        </w:rPr>
+        <w:t> will sit on</w:t>
+      </w:r>
+      <w:r>
+        <w:rPr>
+          <w:b/>
+          <w:bCs/>
+        </w:rPr>
+        <w:t>.</w:t>
+      </w:r>
+    </w:p>
+    <w:p>
+      <w:pPr>
+        <w:rPr>
+          <w:b/>
+          <w:bCs/>
+        </w:rPr>
+      </w:pPr>
+      <w:r>
+        <w:rPr>
+          <w:b/>
+          <w:bCs/>
+        </w:rPr>
+        <w:t> </w:t>
+      </w:r>
+    </w:p>
+    <w:p>
+      <w:pPr>
+        <w:rPr>
+          <w:b/>
+          <w:bCs/>
+        </w:rPr>
+      </w:pPr>
+      <w:r>
+        <w:rPr>
+          <w:b/>
+          <w:bCs/>
+        </w:rPr>
+        <w:t>Example 1:</w:t>
+      </w:r>
+    </w:p>
+    <w:p>
+      <w:pPr>
+        <w:rPr>
+          <w:b/>
+          <w:bCs/>
+        </w:rPr>
+      </w:pPr>
+      <w:r>
+        <w:rPr>
+          <w:b/>
+          <w:bCs/>
+        </w:rPr>
+        <w:t xml:space="preserve">Input: times = [[1,4],[2,3],[4,6]], </w:t>
+      </w:r>
+      <w:proofErr w:type="spellStart"/>
+      <w:r>
+        <w:rPr>
+          <w:b/>
+          <w:bCs/>
+        </w:rPr>
+        <w:t>targetFriend</w:t>
+      </w:r>
+      <w:proofErr w:type="spellEnd"/>
+      <w:r>
+        <w:rPr>
+          <w:b/>
+          <w:bCs/>
+        </w:rPr>
+        <w:t xml:space="preserve"> = 1</w:t>
+      </w:r>
+    </w:p>
+    <w:p>
+      <w:pPr>
+        <w:rPr>
+          <w:b/>
+          <w:bCs/>
+        </w:rPr>
+      </w:pPr>
+      <w:r>
+        <w:rPr>
+          <w:b/>
+          <w:bCs/>
+        </w:rPr>
+        <w:t>Output: 1</w:t>
+      </w:r>
+    </w:p>
+    <w:p>
+      <w:pPr>
+        <w:rPr>
+          <w:b/>
+          <w:bCs/>
+        </w:rPr>
+      </w:pPr>
+      <w:r>
+        <w:rPr>
+          <w:b/>
+          <w:bCs/>
+        </w:rPr>
+        <w:t xml:space="preserve">Explanation: </w:t>
+      </w:r>
+    </w:p>
+    <w:p>
+      <w:pPr>
+        <w:rPr>
+          <w:b/>
+          <w:bCs/>
+        </w:rPr>
+      </w:pPr>
+      <w:r>
+        <w:rPr>
+          <w:b/>
+          <w:bCs/>
+        </w:rPr>
+        <w:t>- Friend 0 arrives at time 1 and sits on chair 0.</w:t>
+      </w:r>
+    </w:p>
+    <w:p>
+      <w:pPr>
+        <w:rPr>
+          <w:b/>
+          <w:bCs/>
+        </w:rPr>
+      </w:pPr>
+      <w:r>
+        <w:rPr>
+          <w:b/>
+          <w:bCs/>
+        </w:rPr>
+        <w:t>- Friend 1 arrives at time 2 and sits on chair 1.</w:t>
+      </w:r>
+    </w:p>
+    <w:p>
+      <w:pPr>
+        <w:rPr>
+          <w:b/>
+          <w:bCs/>
+        </w:rPr>
+      </w:pPr>
+      <w:r>
+        <w:rPr>
+          <w:b/>
+          <w:bCs/>
+        </w:rPr>
+        <w:t>- Friend 1 leaves at time 3 and chair 1 becomes empty.</w:t>
+      </w:r>
+    </w:p>
+    <w:p>
+      <w:pPr>
+        <w:rPr>
+          <w:b/>
+          <w:bCs/>
+        </w:rPr>
+      </w:pPr>
+      <w:r>
+        <w:rPr>
+          <w:b/>
+          <w:bCs/>
+        </w:rPr>
+        <w:t>- Friend 0 leaves at time 4 and chair 0 becomes empty.</w:t>
+      </w:r>
+    </w:p>
+    <w:p>
+      <w:pPr>
+        <w:rPr>
+          <w:b/>
+          <w:bCs/>
+        </w:rPr>
+      </w:pPr>
+      <w:r>
+        <w:rPr>
+          <w:b/>
+          <w:bCs/>
+        </w:rPr>
+        <w:t>- Friend 2 arrives at time 4 and sits on chair 0.</w:t>
+      </w:r>
+    </w:p>
+    <w:p>
+      <w:pPr>
+        <w:rPr>
+          <w:b/>
+          <w:bCs/>
+        </w:rPr>
+      </w:pPr>
+      <w:r>
+        <w:rPr>
+          <w:b/>
+          <w:bCs/>
+        </w:rPr>
+        <w:t>Since friend 1 sat on chair 1, we return 1.</w:t>
+      </w:r>
+    </w:p>
+    <w:p>
+      <w:pPr>
+        <w:rPr>
+          <w:b/>
+          <w:bCs/>
+        </w:rPr>
+      </w:pPr>
+      <w:r>
+        <w:rPr>
+          <w:b/>
+          <w:bCs/>
+        </w:rPr>
+        <w:t>APP:</w:t>
+      </w:r>
+    </w:p>
+    <w:p>
+      <w:pPr>
+        <w:rPr>
+          <w:b/>
+          <w:bCs/>
+        </w:rPr>
+      </w:pPr>
+      <w:r>
+        <w:rPr>
+          <w:b/>
+          <w:bCs/>
+        </w:rPr>
+        <w:t>-&gt;same logic as the meeting rooms</w:t>
+      </w:r>
+    </w:p>
+    <w:p>
+      <w:pPr>
+        <w:rPr>
+          <w:b/>
+          <w:bCs/>
+        </w:rPr>
+      </w:pPr>
+      <w:r>
+        <w:rPr>
+          <w:b/>
+          <w:bCs/>
+        </w:rPr>
+        <w:t xml:space="preserve">-&gt;put the start , end , index as an </w:t>
+      </w:r>
+      <w:proofErr w:type="spellStart"/>
+      <w:r>
+        <w:rPr>
+          <w:b/>
+          <w:bCs/>
+        </w:rPr>
+        <w:t>arr</w:t>
+      </w:r>
+      <w:proofErr w:type="spellEnd"/>
+      <w:r>
+        <w:rPr>
+          <w:b/>
+          <w:bCs/>
+        </w:rPr>
+        <w:t xml:space="preserve"> and sort by arrival time</w:t>
+      </w:r>
+    </w:p>
+    <w:p>
+      <w:pPr>
+        <w:rPr>
+          <w:b/>
+          <w:bCs/>
+        </w:rPr>
+      </w:pPr>
+      <w:r>
+        <w:rPr>
+          <w:b/>
+          <w:bCs/>
+        </w:rPr>
+        <w:t xml:space="preserve">-&gt;construct a min heap of free chairs </w:t>
+      </w:r>
+      <w:proofErr w:type="spellStart"/>
+      <w:r>
+        <w:rPr>
+          <w:b/>
+          <w:bCs/>
+        </w:rPr>
+        <w:t>upto</w:t>
+      </w:r>
+      <w:proofErr w:type="spellEnd"/>
+      <w:r>
+        <w:rPr>
+          <w:b/>
+          <w:bCs/>
+        </w:rPr>
+        <w:t xml:space="preserve"> n-1 </w:t>
+      </w:r>
+      <w:proofErr w:type="spellStart"/>
+      <w:r>
+        <w:rPr>
+          <w:b/>
+          <w:bCs/>
+        </w:rPr>
+        <w:t>bcoz</w:t>
+      </w:r>
+      <w:proofErr w:type="spellEnd"/>
+      <w:r>
+        <w:rPr>
+          <w:b/>
+          <w:bCs/>
+        </w:rPr>
+        <w:t xml:space="preserve"> max is n-1 friends</w:t>
+      </w:r>
+    </w:p>
+    <w:p>
+      <w:pPr>
+        <w:rPr>
+          <w:b/>
+          <w:bCs/>
+        </w:rPr>
+      </w:pPr>
+      <w:r>
+        <w:rPr>
+          <w:b/>
+          <w:bCs/>
+        </w:rPr>
+        <w:t>-&gt;construct a busy based on the end time that is also min heap</w:t>
+      </w:r>
+    </w:p>
+    <w:p>
+      <w:pPr>
+        <w:rPr>
+          <w:b/>
+          <w:bCs/>
+        </w:rPr>
+      </w:pPr>
+      <w:r>
+        <w:rPr>
+          <w:b/>
+          <w:bCs/>
+        </w:rPr>
+        <w:t>-&gt;if the busy heap’s top’s end time has arrived (</w:t>
+      </w:r>
+      <w:proofErr w:type="spellStart"/>
+      <w:r>
+        <w:rPr>
+          <w:b/>
+          <w:bCs/>
+        </w:rPr>
+        <w:t>busy.peek</w:t>
+      </w:r>
+      <w:proofErr w:type="spellEnd"/>
+      <w:r>
+        <w:rPr>
+          <w:b/>
+          <w:bCs/>
+        </w:rPr>
+        <w:t xml:space="preserve">()[0]&lt;=arrival) of </w:t>
+      </w:r>
+      <w:proofErr w:type="spellStart"/>
+      <w:r>
+        <w:rPr>
+          <w:b/>
+          <w:bCs/>
+        </w:rPr>
+        <w:t>curr</w:t>
+      </w:r>
+      <w:proofErr w:type="spellEnd"/>
+      <w:r>
+        <w:rPr>
+          <w:b/>
+          <w:bCs/>
+        </w:rPr>
+        <w:t xml:space="preserve"> </w:t>
+      </w:r>
+      <w:proofErr w:type="spellStart"/>
+      <w:r>
+        <w:rPr>
+          <w:b/>
+          <w:bCs/>
+        </w:rPr>
+        <w:t>frnd</w:t>
+      </w:r>
+      <w:proofErr w:type="spellEnd"/>
+      <w:r>
+        <w:rPr>
+          <w:b/>
+          <w:bCs/>
+        </w:rPr>
+        <w:t xml:space="preserve"> </w:t>
+      </w:r>
+    </w:p>
+    <w:p>
+      <w:pPr>
+        <w:rPr>
+          <w:b/>
+          <w:bCs/>
+        </w:rPr>
+      </w:pPr>
+      <w:r>
+        <w:rPr>
+          <w:b/>
+          <w:bCs/>
+        </w:rPr>
+        <w:t xml:space="preserve">Free that chair and put it in the free </w:t>
+      </w:r>
+      <w:proofErr w:type="spellStart"/>
+      <w:r>
+        <w:rPr>
+          <w:b/>
+          <w:bCs/>
+        </w:rPr>
+        <w:t>pq</w:t>
+      </w:r>
+      <w:proofErr w:type="spellEnd"/>
+      <w:r>
+        <w:rPr>
+          <w:b/>
+          <w:bCs/>
+        </w:rPr>
+        <w:t xml:space="preserve"> and then get a chair for the </w:t>
+      </w:r>
+      <w:proofErr w:type="spellStart"/>
+      <w:r>
+        <w:rPr>
+          <w:b/>
+          <w:bCs/>
+        </w:rPr>
+        <w:t>currPerson</w:t>
+      </w:r>
+      <w:proofErr w:type="spellEnd"/>
+    </w:p>
+    <w:p>
+      <w:pPr>
+        <w:rPr>
+          <w:b/>
+          <w:bCs/>
+        </w:rPr>
+      </w:pPr>
+      <w:r>
+        <w:rPr>
+          <w:b/>
+          <w:bCs/>
+        </w:rPr>
+        <w:t xml:space="preserve">-&gt;if the </w:t>
+      </w:r>
+      <w:proofErr w:type="spellStart"/>
+      <w:r>
+        <w:rPr>
+          <w:b/>
+          <w:bCs/>
+        </w:rPr>
+        <w:t>idx</w:t>
+      </w:r>
+      <w:proofErr w:type="spellEnd"/>
+      <w:r>
+        <w:rPr>
+          <w:b/>
+          <w:bCs/>
+        </w:rPr>
+        <w:t xml:space="preserve"> matches the targeted friend then return the chair else put it as busy </w:t>
+      </w:r>
+    </w:p>
+    <w:p>
+      <w:r>
+        <w:lastRenderedPageBreak/>
+        <w:t>class Solution {</w:t>
+      </w:r>
+    </w:p>
+    <w:p>
+      <w:r>
+        <w:t xml:space="preserve">    public int </w:t>
+      </w:r>
+      <w:proofErr w:type="spellStart"/>
+      <w:r>
+        <w:t>smallestChair</w:t>
+      </w:r>
+      <w:proofErr w:type="spellEnd"/>
+      <w:r>
+        <w:t xml:space="preserve">(int[][] times, int </w:t>
+      </w:r>
+      <w:proofErr w:type="spellStart"/>
+      <w:r>
+        <w:t>targetFriend</w:t>
+      </w:r>
+      <w:proofErr w:type="spellEnd"/>
+      <w:r>
+        <w:t>) {</w:t>
+      </w:r>
+    </w:p>
+    <w:p>
+      <w:r>
+        <w:t xml:space="preserve">        int n = </w:t>
+      </w:r>
+      <w:proofErr w:type="spellStart"/>
+      <w:r>
+        <w:t>times.length</w:t>
+      </w:r>
+      <w:proofErr w:type="spellEnd"/>
+      <w:r>
+        <w:t>;</w:t>
+      </w:r>
+    </w:p>
+    <w:p>
+      <w:r>
+        <w:t xml:space="preserve">        int[][] </w:t>
+      </w:r>
+      <w:proofErr w:type="spellStart"/>
+      <w:r>
+        <w:t>arr</w:t>
+      </w:r>
+      <w:proofErr w:type="spellEnd"/>
+      <w:r>
+        <w:t xml:space="preserve"> = new int[n][3]; </w:t>
+      </w:r>
+    </w:p>
+    <w:p>
+      <w:r>
+        <w:t xml:space="preserve">        for (int </w:t>
+      </w:r>
+      <w:proofErr w:type="spellStart"/>
+      <w:r>
+        <w:t>i</w:t>
+      </w:r>
+      <w:proofErr w:type="spellEnd"/>
+      <w:r>
+        <w:t xml:space="preserve"> = 0; </w:t>
+      </w:r>
+      <w:proofErr w:type="spellStart"/>
+      <w:r>
+        <w:t>i</w:t>
+      </w:r>
+      <w:proofErr w:type="spellEnd"/>
+      <w:r>
+        <w:t xml:space="preserve"> &lt; n; </w:t>
+      </w:r>
+      <w:proofErr w:type="spellStart"/>
+      <w:r>
+        <w:t>i</w:t>
+      </w:r>
+      <w:proofErr w:type="spellEnd"/>
+      <w:r>
+        <w:t>++) {</w:t>
+      </w:r>
+    </w:p>
+    <w:p>
+      <w:r>
+        <w:t xml:space="preserve">            </w:t>
+      </w:r>
+      <w:proofErr w:type="spellStart"/>
+      <w:r>
+        <w:t>arr</w:t>
+      </w:r>
+      <w:proofErr w:type="spellEnd"/>
+      <w:r>
+        <w:t>[</w:t>
+      </w:r>
+      <w:proofErr w:type="spellStart"/>
+      <w:r>
+        <w:t>i</w:t>
+      </w:r>
+      <w:proofErr w:type="spellEnd"/>
+      <w:r>
+        <w:t>][0] = times[</w:t>
+      </w:r>
+      <w:proofErr w:type="spellStart"/>
+      <w:r>
+        <w:t>i</w:t>
+      </w:r>
+      <w:proofErr w:type="spellEnd"/>
+      <w:r>
+        <w:t>][0];</w:t>
+      </w:r>
+    </w:p>
+    <w:p>
+      <w:r>
+        <w:t xml:space="preserve">            </w:t>
+      </w:r>
+      <w:proofErr w:type="spellStart"/>
+      <w:r>
+        <w:t>arr</w:t>
+      </w:r>
+      <w:proofErr w:type="spellEnd"/>
+      <w:r>
+        <w:t>[</w:t>
+      </w:r>
+      <w:proofErr w:type="spellStart"/>
+      <w:r>
+        <w:t>i</w:t>
+      </w:r>
+      <w:proofErr w:type="spellEnd"/>
+      <w:r>
+        <w:t>][1] = times[</w:t>
+      </w:r>
+      <w:proofErr w:type="spellStart"/>
+      <w:r>
+        <w:t>i</w:t>
+      </w:r>
+      <w:proofErr w:type="spellEnd"/>
+      <w:r>
+        <w:t>][1];</w:t>
+      </w:r>
+    </w:p>
+    <w:p>
+      <w:r>
+        <w:t xml:space="preserve">            </w:t>
+      </w:r>
+      <w:proofErr w:type="spellStart"/>
+      <w:r>
+        <w:t>arr</w:t>
+      </w:r>
+      <w:proofErr w:type="spellEnd"/>
+      <w:r>
+        <w:t>[</w:t>
+      </w:r>
+      <w:proofErr w:type="spellStart"/>
+      <w:r>
+        <w:t>i</w:t>
+      </w:r>
+      <w:proofErr w:type="spellEnd"/>
+      <w:r>
+        <w:t xml:space="preserve">][2] = </w:t>
+      </w:r>
+      <w:proofErr w:type="spellStart"/>
+      <w:r>
+        <w:t>i</w:t>
+      </w:r>
+      <w:proofErr w:type="spellEnd"/>
+      <w:r>
+        <w:t>;</w:t>
+      </w:r>
+    </w:p>
+    <w:p>
+      <w:r>
+        <w:t>        }</w:t>
+      </w:r>
+    </w:p>
+    <w:p>
+      <w:r>
+        <w:t xml:space="preserve">        </w:t>
+      </w:r>
+      <w:proofErr w:type="spellStart"/>
+      <w:r>
+        <w:t>Arrays.sort</w:t>
+      </w:r>
+      <w:proofErr w:type="spellEnd"/>
+      <w:r>
+        <w:t>(</w:t>
+      </w:r>
+      <w:proofErr w:type="spellStart"/>
+      <w:r>
+        <w:t>arr</w:t>
+      </w:r>
+      <w:proofErr w:type="spellEnd"/>
+      <w:r>
+        <w:t>, (a, b) -&gt; a[0] - b[0]);//based on arrival time</w:t>
+      </w:r>
+    </w:p>
+    <w:p/>
+    <w:p>
+      <w:r>
+        <w:t>        // free chairs</w:t>
+      </w:r>
+    </w:p>
+    <w:p>
+      <w:r>
+        <w:t xml:space="preserve">        </w:t>
+      </w:r>
+      <w:proofErr w:type="spellStart"/>
+      <w:r>
+        <w:t>PriorityQueue</w:t>
+      </w:r>
+      <w:proofErr w:type="spellEnd"/>
+      <w:r>
+        <w:t xml:space="preserve">&lt;Integer&gt; free = new </w:t>
+      </w:r>
+      <w:proofErr w:type="spellStart"/>
+      <w:r>
+        <w:t>PriorityQueue</w:t>
+      </w:r>
+      <w:proofErr w:type="spellEnd"/>
+      <w:r>
+        <w:t>&lt;&gt;();</w:t>
+      </w:r>
+    </w:p>
+    <w:p>
+      <w:r>
+        <w:t xml:space="preserve">        for (int </w:t>
+      </w:r>
+      <w:proofErr w:type="spellStart"/>
+      <w:r>
+        <w:t>i</w:t>
+      </w:r>
+      <w:proofErr w:type="spellEnd"/>
+      <w:r>
+        <w:t xml:space="preserve"> = 0; </w:t>
+      </w:r>
+      <w:proofErr w:type="spellStart"/>
+      <w:r>
+        <w:t>i</w:t>
+      </w:r>
+      <w:proofErr w:type="spellEnd"/>
+      <w:r>
+        <w:t xml:space="preserve"> &lt; n; </w:t>
+      </w:r>
+      <w:proofErr w:type="spellStart"/>
+      <w:r>
+        <w:t>i</w:t>
+      </w:r>
+      <w:proofErr w:type="spellEnd"/>
+      <w:r>
+        <w:t xml:space="preserve">++) </w:t>
+      </w:r>
+    </w:p>
+    <w:p>
+      <w:r>
+        <w:t xml:space="preserve">            </w:t>
+      </w:r>
+      <w:proofErr w:type="spellStart"/>
+      <w:r>
+        <w:t>free.offer</w:t>
+      </w:r>
+      <w:proofErr w:type="spellEnd"/>
+      <w:r>
+        <w:t>(</w:t>
+      </w:r>
+      <w:proofErr w:type="spellStart"/>
+      <w:r>
+        <w:t>i</w:t>
+      </w:r>
+      <w:proofErr w:type="spellEnd"/>
+      <w:r>
+        <w:t>);</w:t>
+      </w:r>
+    </w:p>
+    <w:p/>
+    <w:p>
+      <w:r>
+        <w:t>        // occupied chairs → [</w:t>
+      </w:r>
+      <w:proofErr w:type="spellStart"/>
+      <w:r>
+        <w:t>leaveTime</w:t>
+      </w:r>
+      <w:proofErr w:type="spellEnd"/>
+      <w:r>
+        <w:t>, chair]</w:t>
+      </w:r>
+    </w:p>
+    <w:p>
+      <w:r>
+        <w:t xml:space="preserve">        </w:t>
+      </w:r>
+      <w:proofErr w:type="spellStart"/>
+      <w:r>
+        <w:t>PriorityQueue</w:t>
+      </w:r>
+      <w:proofErr w:type="spellEnd"/>
+      <w:r>
+        <w:t xml:space="preserve">&lt;int[]&gt; occupied = new </w:t>
+      </w:r>
+      <w:proofErr w:type="spellStart"/>
+      <w:r>
+        <w:t>PriorityQueue</w:t>
+      </w:r>
+      <w:proofErr w:type="spellEnd"/>
+      <w:r>
+        <w:t>&lt;&gt;((</w:t>
+      </w:r>
+      <w:proofErr w:type="spellStart"/>
+      <w:r>
+        <w:t>a,b</w:t>
+      </w:r>
+      <w:proofErr w:type="spellEnd"/>
+      <w:r>
+        <w:t>)-&gt;a[0]-b[0]);</w:t>
+      </w:r>
+    </w:p>
+    <w:p/>
+    <w:p>
+      <w:r>
+        <w:t xml:space="preserve">        for (int[] f : </w:t>
+      </w:r>
+      <w:proofErr w:type="spellStart"/>
+      <w:r>
+        <w:t>arr</w:t>
+      </w:r>
+      <w:proofErr w:type="spellEnd"/>
+      <w:r>
+        <w:t>) {</w:t>
+      </w:r>
+    </w:p>
+    <w:p>
+      <w:r>
+        <w:t>            int arrival = f[0];</w:t>
+      </w:r>
+    </w:p>
+    <w:p>
+      <w:r>
+        <w:t>            int leave = f[1];</w:t>
+      </w:r>
+    </w:p>
+    <w:p>
+      <w:r>
+        <w:t xml:space="preserve">            int </w:t>
+      </w:r>
+      <w:proofErr w:type="spellStart"/>
+      <w:r>
+        <w:t>idx</w:t>
+      </w:r>
+      <w:proofErr w:type="spellEnd"/>
+      <w:r>
+        <w:t xml:space="preserve"> = f[2];</w:t>
+      </w:r>
+    </w:p>
+    <w:p/>
+    <w:p>
+      <w:r>
+        <w:t>           </w:t>
+      </w:r>
+    </w:p>
+    <w:p/>
+    <w:p/>
+    <w:p/>
+    <w:p>
+      <w:r>
+        <w:lastRenderedPageBreak/>
+        <w:t xml:space="preserve"> // free chairs</w:t>
+      </w:r>
+    </w:p>
+    <w:p>
+      <w:r>
+        <w:t>            while (!</w:t>
+      </w:r>
+      <w:proofErr w:type="spellStart"/>
+      <w:r>
+        <w:t>occupied.isEmpty</w:t>
+      </w:r>
+      <w:proofErr w:type="spellEnd"/>
+      <w:r>
+        <w:t xml:space="preserve">() &amp;&amp; </w:t>
+      </w:r>
+      <w:proofErr w:type="spellStart"/>
+      <w:r>
+        <w:t>occupied.peek</w:t>
+      </w:r>
+      <w:proofErr w:type="spellEnd"/>
+      <w:r>
+        <w:t>()[0] &lt;= arrival)</w:t>
+      </w:r>
+    </w:p>
+    <w:p>
+      <w:r>
+        <w:t xml:space="preserve">//this means the friend is going to leave the chair is going to be free simply saying means </w:t>
+      </w:r>
+      <w:proofErr w:type="spellStart"/>
+      <w:r>
+        <w:t>prev</w:t>
+      </w:r>
+      <w:proofErr w:type="spellEnd"/>
+      <w:r>
+        <w:t xml:space="preserve"> </w:t>
+      </w:r>
+      <w:proofErr w:type="spellStart"/>
+      <w:r>
+        <w:t>frnd</w:t>
+      </w:r>
+      <w:proofErr w:type="spellEnd"/>
+      <w:r>
+        <w:t xml:space="preserve"> </w:t>
+      </w:r>
+      <w:proofErr w:type="spellStart"/>
+      <w:r>
+        <w:t>endtime</w:t>
+      </w:r>
+      <w:proofErr w:type="spellEnd"/>
+      <w:r>
+        <w:t xml:space="preserve">&lt;= </w:t>
+      </w:r>
+      <w:proofErr w:type="spellStart"/>
+      <w:r>
+        <w:t>curr</w:t>
+      </w:r>
+      <w:proofErr w:type="spellEnd"/>
+      <w:r>
+        <w:t xml:space="preserve"> </w:t>
+      </w:r>
+      <w:proofErr w:type="spellStart"/>
+      <w:r>
+        <w:t>frnd</w:t>
+      </w:r>
+      <w:proofErr w:type="spellEnd"/>
+      <w:r>
+        <w:t xml:space="preserve"> start time</w:t>
+      </w:r>
+    </w:p>
+    <w:p>
+      <w:r>
+        <w:t>             {</w:t>
+      </w:r>
+    </w:p>
+    <w:p>
+      <w:r>
+        <w:t xml:space="preserve">                </w:t>
+      </w:r>
+      <w:proofErr w:type="spellStart"/>
+      <w:r>
+        <w:t>free.offer</w:t>
+      </w:r>
+      <w:proofErr w:type="spellEnd"/>
+      <w:r>
+        <w:t>(</w:t>
+      </w:r>
+      <w:proofErr w:type="spellStart"/>
+      <w:r>
+        <w:t>occupied.poll</w:t>
+      </w:r>
+      <w:proofErr w:type="spellEnd"/>
+      <w:r>
+        <w:t>()[1]);</w:t>
+      </w:r>
+    </w:p>
+    <w:p>
+      <w:r>
+        <w:t xml:space="preserve">                int chair = </w:t>
+      </w:r>
+      <w:proofErr w:type="spellStart"/>
+      <w:r>
+        <w:t>free.poll</w:t>
+      </w:r>
+      <w:proofErr w:type="spellEnd"/>
+      <w:r>
+        <w:t>();</w:t>
+      </w:r>
+    </w:p>
+    <w:p>
+      <w:r>
+        <w:t>           </w:t>
+      </w:r>
+      <w:r>
+        <w:tab/>
+        <w:t xml:space="preserve">  </w:t>
+      </w:r>
+      <w:r>
+        <w:t xml:space="preserve"> if (</w:t>
+      </w:r>
+      <w:proofErr w:type="spellStart"/>
+      <w:r>
+        <w:t>idx</w:t>
+      </w:r>
+      <w:proofErr w:type="spellEnd"/>
+      <w:r>
+        <w:t xml:space="preserve"> == </w:t>
+      </w:r>
+      <w:proofErr w:type="spellStart"/>
+      <w:r>
+        <w:t>targetFriend</w:t>
+      </w:r>
+      <w:proofErr w:type="spellEnd"/>
+      <w:r>
+        <w:t xml:space="preserve">) </w:t>
+      </w:r>
+    </w:p>
+    <w:p>
+      <w:pPr>
+        <w:ind w:left="720" w:firstLine="720"/>
+      </w:pPr>
+      <w:r>
+        <w:t>return chair;</w:t>
+      </w:r>
+    </w:p>
+    <w:p>
+      <w:r>
+        <w:t xml:space="preserve">            </w:t>
+      </w:r>
+      <w:proofErr w:type="spellStart"/>
+      <w:r>
+        <w:t>occupied.offer</w:t>
+      </w:r>
+      <w:proofErr w:type="spellEnd"/>
+      <w:r>
+        <w:t>(new int[]{leave, chair});</w:t>
+      </w:r>
+    </w:p>
+    <w:p>
+      <w:r>
+        <w:t>        }</w:t>
+      </w:r>
+    </w:p>
+    <w:p>
+      <w:r>
+        <w:t>        return -1;</w:t>
       </w:r>
     </w:p>
     <w:p>
@@ -4390,9 +8166,122 @@
     </w:lvl>
   </w:abstractNum>
   <w:abstractNum w:abstractNumId="1" w15:restartNumberingAfterBreak="0">
-    <w:nsid w:val="3BEF052C"/>
+    <w:nsid w:val="248B2CB8"/>
     <w:multiLevelType w:val="multilevel"/>
-    <w:tmpl w:val="27D8F4F0"/>
+    <w:tmpl w:val="A9300254"/>
+    <w:lvl w:ilvl="0">
+      <w:start w:val="1"/>
+      <w:numFmt w:val="decimal"/>
+      <w:lvlText w:val="%1."/>
+      <w:lvlJc w:val="left"/>
+      <w:pPr>
+        <w:tabs>
+          <w:tab w:val="num" w:pos="720"/>
+        </w:tabs>
+        <w:ind w:left="720" w:hanging="360"/>
+      </w:pPr>
+    </w:lvl>
+    <w:lvl w:ilvl="1" w:tentative="1">
+      <w:start w:val="1"/>
+      <w:numFmt w:val="decimal"/>
+      <w:lvlText w:val="%2."/>
+      <w:lvlJc w:val="left"/>
+      <w:pPr>
+        <w:tabs>
+          <w:tab w:val="num" w:pos="1440"/>
+        </w:tabs>
+        <w:ind w:left="1440" w:hanging="360"/>
+      </w:pPr>
+    </w:lvl>
+    <w:lvl w:ilvl="2" w:tentative="1">
+      <w:start w:val="1"/>
+      <w:numFmt w:val="decimal"/>
+      <w:lvlText w:val="%3."/>
+      <w:lvlJc w:val="left"/>
+      <w:pPr>
+        <w:tabs>
+          <w:tab w:val="num" w:pos="2160"/>
+        </w:tabs>
+        <w:ind w:left="2160" w:hanging="360"/>
+      </w:pPr>
+    </w:lvl>
+    <w:lvl w:ilvl="3" w:tentative="1">
+      <w:start w:val="1"/>
+      <w:numFmt w:val="decimal"/>
+      <w:lvlText w:val="%4."/>
+      <w:lvlJc w:val="left"/>
+      <w:pPr>
+        <w:tabs>
+          <w:tab w:val="num" w:pos="2880"/>
+        </w:tabs>
+        <w:ind w:left="2880" w:hanging="360"/>
+      </w:pPr>
+    </w:lvl>
+    <w:lvl w:ilvl="4" w:tentative="1">
+      <w:start w:val="1"/>
+      <w:numFmt w:val="decimal"/>
+      <w:lvlText w:val="%5."/>
+      <w:lvlJc w:val="left"/>
+      <w:pPr>
+        <w:tabs>
+          <w:tab w:val="num" w:pos="3600"/>
+        </w:tabs>
+        <w:ind w:left="3600" w:hanging="360"/>
+      </w:pPr>
+    </w:lvl>
+    <w:lvl w:ilvl="5" w:tentative="1">
+      <w:start w:val="1"/>
+      <w:numFmt w:val="decimal"/>
+      <w:lvlText w:val="%6."/>
+      <w:lvlJc w:val="left"/>
+      <w:pPr>
+        <w:tabs>
+          <w:tab w:val="num" w:pos="4320"/>
+        </w:tabs>
+        <w:ind w:left="4320" w:hanging="360"/>
+      </w:pPr>
+    </w:lvl>
+    <w:lvl w:ilvl="6" w:tentative="1">
+      <w:start w:val="1"/>
+      <w:numFmt w:val="decimal"/>
+      <w:lvlText w:val="%7."/>
+      <w:lvlJc w:val="left"/>
+      <w:pPr>
+        <w:tabs>
+          <w:tab w:val="num" w:pos="5040"/>
+        </w:tabs>
+        <w:ind w:left="5040" w:hanging="360"/>
+      </w:pPr>
+    </w:lvl>
+    <w:lvl w:ilvl="7" w:tentative="1">
+      <w:start w:val="1"/>
+      <w:numFmt w:val="decimal"/>
+      <w:lvlText w:val="%8."/>
+      <w:lvlJc w:val="left"/>
+      <w:pPr>
+        <w:tabs>
+          <w:tab w:val="num" w:pos="5760"/>
+        </w:tabs>
+        <w:ind w:left="5760" w:hanging="360"/>
+      </w:pPr>
+    </w:lvl>
+    <w:lvl w:ilvl="8" w:tentative="1">
+      <w:start w:val="1"/>
+      <w:numFmt w:val="decimal"/>
+      <w:lvlText w:val="%9."/>
+      <w:lvlJc w:val="left"/>
+      <w:pPr>
+        <w:tabs>
+          <w:tab w:val="num" w:pos="6480"/>
+        </w:tabs>
+        <w:ind w:left="6480" w:hanging="360"/>
+      </w:pPr>
+    </w:lvl>
+  </w:abstractNum>
+  <w:abstractNum w:abstractNumId="2" w15:restartNumberingAfterBreak="0">
+    <w:nsid w:val="2F77340A"/>
+    <w:multiLevelType w:val="multilevel"/>
+    <w:tmpl w:val="26B661F0"/>
     <w:lvl w:ilvl="0">
       <w:start w:val="1"/>
       <w:numFmt w:val="bullet"/>
@@ -4538,10 +8427,10 @@
       </w:rPr>
     </w:lvl>
   </w:abstractNum>
-  <w:abstractNum w:abstractNumId="2" w15:restartNumberingAfterBreak="0">
-    <w:nsid w:val="6C56778D"/>
+  <w:abstractNum w:abstractNumId="3" w15:restartNumberingAfterBreak="0">
+    <w:nsid w:val="3BEF052C"/>
     <w:multiLevelType w:val="multilevel"/>
-    <w:tmpl w:val="4DBCAB12"/>
+    <w:tmpl w:val="27D8F4F0"/>
     <w:lvl w:ilvl="0">
       <w:start w:val="1"/>
       <w:numFmt w:val="bullet"/>
@@ -4687,10 +8576,10 @@
       </w:rPr>
     </w:lvl>
   </w:abstractNum>
-  <w:abstractNum w:abstractNumId="3" w15:restartNumberingAfterBreak="0">
-    <w:nsid w:val="76C065A6"/>
+  <w:abstractNum w:abstractNumId="4" w15:restartNumberingAfterBreak="0">
+    <w:nsid w:val="5C056929"/>
     <w:multiLevelType w:val="multilevel"/>
-    <w:tmpl w:val="D558168C"/>
+    <w:tmpl w:val="10505116"/>
     <w:lvl w:ilvl="0">
       <w:start w:val="1"/>
       <w:numFmt w:val="bullet"/>
@@ -4836,17 +8725,440 @@
       </w:rPr>
     </w:lvl>
   </w:abstractNum>
+  <w:abstractNum w:abstractNumId="5" w15:restartNumberingAfterBreak="0">
+    <w:nsid w:val="6C56778D"/>
+    <w:multiLevelType w:val="multilevel"/>
+    <w:tmpl w:val="4DBCAB12"/>
+    <w:lvl w:ilvl="0">
+      <w:start w:val="1"/>
+      <w:numFmt w:val="bullet"/>
+      <w:lvlText w:val=""/>
+      <w:lvlJc w:val="left"/>
+      <w:pPr>
+        <w:tabs>
+          <w:tab w:val="num" w:pos="720"/>
+        </w:tabs>
+        <w:ind w:left="720" w:hanging="360"/>
+      </w:pPr>
+      <w:rPr>
+        <w:rFonts w:ascii="Symbol" w:hAnsi="Symbol" w:hint="default"/>
+        <w:sz w:val="20"/>
+      </w:rPr>
+    </w:lvl>
+    <w:lvl w:ilvl="1" w:tentative="1">
+      <w:start w:val="1"/>
+      <w:numFmt w:val="bullet"/>
+      <w:lvlText w:val=""/>
+      <w:lvlJc w:val="left"/>
+      <w:pPr>
+        <w:tabs>
+          <w:tab w:val="num" w:pos="1440"/>
+        </w:tabs>
+        <w:ind w:left="1440" w:hanging="360"/>
+      </w:pPr>
+      <w:rPr>
+        <w:rFonts w:ascii="Symbol" w:hAnsi="Symbol" w:hint="default"/>
+        <w:sz w:val="20"/>
+      </w:rPr>
+    </w:lvl>
+    <w:lvl w:ilvl="2" w:tentative="1">
+      <w:start w:val="1"/>
+      <w:numFmt w:val="bullet"/>
+      <w:lvlText w:val=""/>
+      <w:lvlJc w:val="left"/>
+      <w:pPr>
+        <w:tabs>
+          <w:tab w:val="num" w:pos="2160"/>
+        </w:tabs>
+        <w:ind w:left="2160" w:hanging="360"/>
+      </w:pPr>
+      <w:rPr>
+        <w:rFonts w:ascii="Symbol" w:hAnsi="Symbol" w:hint="default"/>
+        <w:sz w:val="20"/>
+      </w:rPr>
+    </w:lvl>
+    <w:lvl w:ilvl="3" w:tentative="1">
+      <w:start w:val="1"/>
+      <w:numFmt w:val="bullet"/>
+      <w:lvlText w:val=""/>
+      <w:lvlJc w:val="left"/>
+      <w:pPr>
+        <w:tabs>
+          <w:tab w:val="num" w:pos="2880"/>
+        </w:tabs>
+        <w:ind w:left="2880" w:hanging="360"/>
+      </w:pPr>
+      <w:rPr>
+        <w:rFonts w:ascii="Symbol" w:hAnsi="Symbol" w:hint="default"/>
+        <w:sz w:val="20"/>
+      </w:rPr>
+    </w:lvl>
+    <w:lvl w:ilvl="4" w:tentative="1">
+      <w:start w:val="1"/>
+      <w:numFmt w:val="bullet"/>
+      <w:lvlText w:val=""/>
+      <w:lvlJc w:val="left"/>
+      <w:pPr>
+        <w:tabs>
+          <w:tab w:val="num" w:pos="3600"/>
+        </w:tabs>
+        <w:ind w:left="3600" w:hanging="360"/>
+      </w:pPr>
+      <w:rPr>
+        <w:rFonts w:ascii="Symbol" w:hAnsi="Symbol" w:hint="default"/>
+        <w:sz w:val="20"/>
+      </w:rPr>
+    </w:lvl>
+    <w:lvl w:ilvl="5" w:tentative="1">
+      <w:start w:val="1"/>
+      <w:numFmt w:val="bullet"/>
+      <w:lvlText w:val=""/>
+      <w:lvlJc w:val="left"/>
+      <w:pPr>
+        <w:tabs>
+          <w:tab w:val="num" w:pos="4320"/>
+        </w:tabs>
+        <w:ind w:left="4320" w:hanging="360"/>
+      </w:pPr>
+      <w:rPr>
+        <w:rFonts w:ascii="Symbol" w:hAnsi="Symbol" w:hint="default"/>
+        <w:sz w:val="20"/>
+      </w:rPr>
+    </w:lvl>
+    <w:lvl w:ilvl="6" w:tentative="1">
+      <w:start w:val="1"/>
+      <w:numFmt w:val="bullet"/>
+      <w:lvlText w:val=""/>
+      <w:lvlJc w:val="left"/>
+      <w:pPr>
+        <w:tabs>
+          <w:tab w:val="num" w:pos="5040"/>
+        </w:tabs>
+        <w:ind w:left="5040" w:hanging="360"/>
+      </w:pPr>
+      <w:rPr>
+        <w:rFonts w:ascii="Symbol" w:hAnsi="Symbol" w:hint="default"/>
+        <w:sz w:val="20"/>
+      </w:rPr>
+    </w:lvl>
+    <w:lvl w:ilvl="7" w:tentative="1">
+      <w:start w:val="1"/>
+      <w:numFmt w:val="bullet"/>
+      <w:lvlText w:val=""/>
+      <w:lvlJc w:val="left"/>
+      <w:pPr>
+        <w:tabs>
+          <w:tab w:val="num" w:pos="5760"/>
+        </w:tabs>
+        <w:ind w:left="5760" w:hanging="360"/>
+      </w:pPr>
+      <w:rPr>
+        <w:rFonts w:ascii="Symbol" w:hAnsi="Symbol" w:hint="default"/>
+        <w:sz w:val="20"/>
+      </w:rPr>
+    </w:lvl>
+    <w:lvl w:ilvl="8" w:tentative="1">
+      <w:start w:val="1"/>
+      <w:numFmt w:val="bullet"/>
+      <w:lvlText w:val=""/>
+      <w:lvlJc w:val="left"/>
+      <w:pPr>
+        <w:tabs>
+          <w:tab w:val="num" w:pos="6480"/>
+        </w:tabs>
+        <w:ind w:left="6480" w:hanging="360"/>
+      </w:pPr>
+      <w:rPr>
+        <w:rFonts w:ascii="Symbol" w:hAnsi="Symbol" w:hint="default"/>
+        <w:sz w:val="20"/>
+      </w:rPr>
+    </w:lvl>
+  </w:abstractNum>
+  <w:abstractNum w:abstractNumId="6" w15:restartNumberingAfterBreak="0">
+    <w:nsid w:val="76C065A6"/>
+    <w:multiLevelType w:val="multilevel"/>
+    <w:tmpl w:val="D558168C"/>
+    <w:lvl w:ilvl="0">
+      <w:start w:val="1"/>
+      <w:numFmt w:val="bullet"/>
+      <w:lvlText w:val=""/>
+      <w:lvlJc w:val="left"/>
+      <w:pPr>
+        <w:tabs>
+          <w:tab w:val="num" w:pos="720"/>
+        </w:tabs>
+        <w:ind w:left="720" w:hanging="360"/>
+      </w:pPr>
+      <w:rPr>
+        <w:rFonts w:ascii="Symbol" w:hAnsi="Symbol" w:hint="default"/>
+        <w:sz w:val="20"/>
+      </w:rPr>
+    </w:lvl>
+    <w:lvl w:ilvl="1" w:tentative="1">
+      <w:start w:val="1"/>
+      <w:numFmt w:val="bullet"/>
+      <w:lvlText w:val=""/>
+      <w:lvlJc w:val="left"/>
+      <w:pPr>
+        <w:tabs>
+          <w:tab w:val="num" w:pos="1440"/>
+        </w:tabs>
+        <w:ind w:left="1440" w:hanging="360"/>
+      </w:pPr>
+      <w:rPr>
+        <w:rFonts w:ascii="Symbol" w:hAnsi="Symbol" w:hint="default"/>
+        <w:sz w:val="20"/>
+      </w:rPr>
+    </w:lvl>
+    <w:lvl w:ilvl="2" w:tentative="1">
+      <w:start w:val="1"/>
+      <w:numFmt w:val="bullet"/>
+      <w:lvlText w:val=""/>
+      <w:lvlJc w:val="left"/>
+      <w:pPr>
+        <w:tabs>
+          <w:tab w:val="num" w:pos="2160"/>
+        </w:tabs>
+        <w:ind w:left="2160" w:hanging="360"/>
+      </w:pPr>
+      <w:rPr>
+        <w:rFonts w:ascii="Symbol" w:hAnsi="Symbol" w:hint="default"/>
+        <w:sz w:val="20"/>
+      </w:rPr>
+    </w:lvl>
+    <w:lvl w:ilvl="3" w:tentative="1">
+      <w:start w:val="1"/>
+      <w:numFmt w:val="bullet"/>
+      <w:lvlText w:val=""/>
+      <w:lvlJc w:val="left"/>
+      <w:pPr>
+        <w:tabs>
+          <w:tab w:val="num" w:pos="2880"/>
+        </w:tabs>
+        <w:ind w:left="2880" w:hanging="360"/>
+      </w:pPr>
+      <w:rPr>
+        <w:rFonts w:ascii="Symbol" w:hAnsi="Symbol" w:hint="default"/>
+        <w:sz w:val="20"/>
+      </w:rPr>
+    </w:lvl>
+    <w:lvl w:ilvl="4" w:tentative="1">
+      <w:start w:val="1"/>
+      <w:numFmt w:val="bullet"/>
+      <w:lvlText w:val=""/>
+      <w:lvlJc w:val="left"/>
+      <w:pPr>
+        <w:tabs>
+          <w:tab w:val="num" w:pos="3600"/>
+        </w:tabs>
+        <w:ind w:left="3600" w:hanging="360"/>
+      </w:pPr>
+      <w:rPr>
+        <w:rFonts w:ascii="Symbol" w:hAnsi="Symbol" w:hint="default"/>
+        <w:sz w:val="20"/>
+      </w:rPr>
+    </w:lvl>
+    <w:lvl w:ilvl="5" w:tentative="1">
+      <w:start w:val="1"/>
+      <w:numFmt w:val="bullet"/>
+      <w:lvlText w:val=""/>
+      <w:lvlJc w:val="left"/>
+      <w:pPr>
+        <w:tabs>
+          <w:tab w:val="num" w:pos="4320"/>
+        </w:tabs>
+        <w:ind w:left="4320" w:hanging="360"/>
+      </w:pPr>
+      <w:rPr>
+        <w:rFonts w:ascii="Symbol" w:hAnsi="Symbol" w:hint="default"/>
+        <w:sz w:val="20"/>
+      </w:rPr>
+    </w:lvl>
+    <w:lvl w:ilvl="6" w:tentative="1">
+      <w:start w:val="1"/>
+      <w:numFmt w:val="bullet"/>
+      <w:lvlText w:val=""/>
+      <w:lvlJc w:val="left"/>
+      <w:pPr>
+        <w:tabs>
+          <w:tab w:val="num" w:pos="5040"/>
+        </w:tabs>
+        <w:ind w:left="5040" w:hanging="360"/>
+      </w:pPr>
+      <w:rPr>
+        <w:rFonts w:ascii="Symbol" w:hAnsi="Symbol" w:hint="default"/>
+        <w:sz w:val="20"/>
+      </w:rPr>
+    </w:lvl>
+    <w:lvl w:ilvl="7" w:tentative="1">
+      <w:start w:val="1"/>
+      <w:numFmt w:val="bullet"/>
+      <w:lvlText w:val=""/>
+      <w:lvlJc w:val="left"/>
+      <w:pPr>
+        <w:tabs>
+          <w:tab w:val="num" w:pos="5760"/>
+        </w:tabs>
+        <w:ind w:left="5760" w:hanging="360"/>
+      </w:pPr>
+      <w:rPr>
+        <w:rFonts w:ascii="Symbol" w:hAnsi="Symbol" w:hint="default"/>
+        <w:sz w:val="20"/>
+      </w:rPr>
+    </w:lvl>
+    <w:lvl w:ilvl="8" w:tentative="1">
+      <w:start w:val="1"/>
+      <w:numFmt w:val="bullet"/>
+      <w:lvlText w:val=""/>
+      <w:lvlJc w:val="left"/>
+      <w:pPr>
+        <w:tabs>
+          <w:tab w:val="num" w:pos="6480"/>
+        </w:tabs>
+        <w:ind w:left="6480" w:hanging="360"/>
+      </w:pPr>
+      <w:rPr>
+        <w:rFonts w:ascii="Symbol" w:hAnsi="Symbol" w:hint="default"/>
+        <w:sz w:val="20"/>
+      </w:rPr>
+    </w:lvl>
+  </w:abstractNum>
+  <w:abstractNum w:abstractNumId="7" w15:restartNumberingAfterBreak="0">
+    <w:nsid w:val="7DA32A06"/>
+    <w:multiLevelType w:val="multilevel"/>
+    <w:tmpl w:val="C16A9B40"/>
+    <w:lvl w:ilvl="0">
+      <w:start w:val="1"/>
+      <w:numFmt w:val="decimal"/>
+      <w:lvlText w:val="%1."/>
+      <w:lvlJc w:val="left"/>
+      <w:pPr>
+        <w:tabs>
+          <w:tab w:val="num" w:pos="720"/>
+        </w:tabs>
+        <w:ind w:left="720" w:hanging="360"/>
+      </w:pPr>
+    </w:lvl>
+    <w:lvl w:ilvl="1" w:tentative="1">
+      <w:start w:val="1"/>
+      <w:numFmt w:val="decimal"/>
+      <w:lvlText w:val="%2."/>
+      <w:lvlJc w:val="left"/>
+      <w:pPr>
+        <w:tabs>
+          <w:tab w:val="num" w:pos="1440"/>
+        </w:tabs>
+        <w:ind w:left="1440" w:hanging="360"/>
+      </w:pPr>
+    </w:lvl>
+    <w:lvl w:ilvl="2" w:tentative="1">
+      <w:start w:val="1"/>
+      <w:numFmt w:val="decimal"/>
+      <w:lvlText w:val="%3."/>
+      <w:lvlJc w:val="left"/>
+      <w:pPr>
+        <w:tabs>
+          <w:tab w:val="num" w:pos="2160"/>
+        </w:tabs>
+        <w:ind w:left="2160" w:hanging="360"/>
+      </w:pPr>
+    </w:lvl>
+    <w:lvl w:ilvl="3" w:tentative="1">
+      <w:start w:val="1"/>
+      <w:numFmt w:val="decimal"/>
+      <w:lvlText w:val="%4."/>
+      <w:lvlJc w:val="left"/>
+      <w:pPr>
+        <w:tabs>
+          <w:tab w:val="num" w:pos="2880"/>
+        </w:tabs>
+        <w:ind w:left="2880" w:hanging="360"/>
+      </w:pPr>
+    </w:lvl>
+    <w:lvl w:ilvl="4" w:tentative="1">
+      <w:start w:val="1"/>
+      <w:numFmt w:val="decimal"/>
+      <w:lvlText w:val="%5."/>
+      <w:lvlJc w:val="left"/>
+      <w:pPr>
+        <w:tabs>
+          <w:tab w:val="num" w:pos="3600"/>
+        </w:tabs>
+        <w:ind w:left="3600" w:hanging="360"/>
+      </w:pPr>
+    </w:lvl>
+    <w:lvl w:ilvl="5" w:tentative="1">
+      <w:start w:val="1"/>
+      <w:numFmt w:val="decimal"/>
+      <w:lvlText w:val="%6."/>
+      <w:lvlJc w:val="left"/>
+      <w:pPr>
+        <w:tabs>
+          <w:tab w:val="num" w:pos="4320"/>
+        </w:tabs>
+        <w:ind w:left="4320" w:hanging="360"/>
+      </w:pPr>
+    </w:lvl>
+    <w:lvl w:ilvl="6" w:tentative="1">
+      <w:start w:val="1"/>
+      <w:numFmt w:val="decimal"/>
+      <w:lvlText w:val="%7."/>
+      <w:lvlJc w:val="left"/>
+      <w:pPr>
+        <w:tabs>
+          <w:tab w:val="num" w:pos="5040"/>
+        </w:tabs>
+        <w:ind w:left="5040" w:hanging="360"/>
+      </w:pPr>
+    </w:lvl>
+    <w:lvl w:ilvl="7" w:tentative="1">
+      <w:start w:val="1"/>
+      <w:numFmt w:val="decimal"/>
+      <w:lvlText w:val="%8."/>
+      <w:lvlJc w:val="left"/>
+      <w:pPr>
+        <w:tabs>
+          <w:tab w:val="num" w:pos="5760"/>
+        </w:tabs>
+        <w:ind w:left="5760" w:hanging="360"/>
+      </w:pPr>
+    </w:lvl>
+    <w:lvl w:ilvl="8" w:tentative="1">
+      <w:start w:val="1"/>
+      <w:numFmt w:val="decimal"/>
+      <w:lvlText w:val="%9."/>
+      <w:lvlJc w:val="left"/>
+      <w:pPr>
+        <w:tabs>
+          <w:tab w:val="num" w:pos="6480"/>
+        </w:tabs>
+        <w:ind w:left="6480" w:hanging="360"/>
+      </w:pPr>
+    </w:lvl>
+  </w:abstractNum>
   <w:num w:numId="1" w16cid:durableId="759642481">
-    <w:abstractNumId w:val="1"/>
+    <w:abstractNumId w:val="3"/>
   </w:num>
   <w:num w:numId="2" w16cid:durableId="890504636">
-    <w:abstractNumId w:val="3"/>
+    <w:abstractNumId w:val="6"/>
   </w:num>
   <w:num w:numId="3" w16cid:durableId="575014730">
-    <w:abstractNumId w:val="2"/>
+    <w:abstractNumId w:val="5"/>
   </w:num>
   <w:num w:numId="4" w16cid:durableId="1522352268">
     <w:abstractNumId w:val="0"/>
+  </w:num>
+  <w:num w:numId="5" w16cid:durableId="1240627829">
+    <w:abstractNumId w:val="1"/>
+  </w:num>
+  <w:num w:numId="6" w16cid:durableId="1687637382">
+    <w:abstractNumId w:val="2"/>
+  </w:num>
+  <w:num w:numId="7" w16cid:durableId="1020162960">
+    <w:abstractNumId w:val="7"/>
+  </w:num>
+  <w:num w:numId="8" w16cid:durableId="413666159">
+    <w:abstractNumId w:val="4"/>
   </w:num>
 </w:numbering>
 </file>

</xml_diff>